<commit_message>
Nehemiah 2nd re-audit: Kislev/Nisan months, Temple of God x4, four winds; GDocs 13/13 verified
</commit_message>
<xml_diff>
--- a/gdocs_build/Nehemiah.docx
+++ b/gdocs_build/Nehemiah.docx
@@ -203,7 +203,7 @@
               <w:rPr>
                 <w:sz w:val="18"/>
               </w:rPr>
-              <w:t>So, it was December, in the twentieth year of the king's reign. I was hanging out at the palace in Susa when my bro Hanani showed up with some other guys from Judah. I was like, 'Yo, what's the situation with our people back home who made it through the exile? How's Jerusalem doing?'</w:t>
+              <w:t>So, it was the month of Kislev, in the twentieth year of the king's reign. I was hanging out at the palace in Susa when my bro Hanani showed up with some other guys from Judah. I was like, 'Yo, what's the situation with our people back home who made it through the exile? How's Jerusalem doing?'</w:t>
             </w:r>
           </w:p>
         </w:tc>
@@ -487,7 +487,7 @@
               <w:rPr>
                 <w:sz w:val="18"/>
               </w:rPr>
-              <w:t>'We've totally disrespected you. We didn't do what you told us, we ignored your commands, and we didn't follow the rules you gave to Moses. But you also promised Moses that if we messed up and you scattered us all over the world, that if we came back to you and started obeying you again, you'd bring us all back to the special place you chose for your Name.'</w:t>
+              <w:t>'We've totally disrespected you. We didn't do what you told us, we ignored your commands, and we didn't follow the rules you gave to Moses. But you also promised Moses that if we messed up and you scattered us to the four winds, that if we came back to you and started obeying you again, you'd bring us all back to the special place you chose for your Name.'</w:t>
             </w:r>
           </w:p>
         </w:tc>
@@ -775,7 +775,7 @@
               <w:rPr>
                 <w:sz w:val="18"/>
               </w:rPr>
-              <w:t>So, it was April, during the 20th year of King Artaxerxes's reign. I was on duty, serving the king his wine, and brought it over to him. I’d literally never looked sad in front of him before, so he was like, “Yo, why the long face? You’re not sick, are you? Or are you just feeling down?”</w:t>
+              <w:t>So, it was the month of Nisan, during the 20th year of King Artaxerxes's reign. I was on duty, serving the king his wine, and brought it over to him. I’d literally never looked sad in front of him before, so he was like, “Yo, why the long face? You’re not sick, are you? Or are you just feeling down?”</w:t>
             </w:r>
           </w:p>
         </w:tc>
@@ -12837,7 +12837,7 @@
               <w:rPr>
                 <w:sz w:val="18"/>
               </w:rPr>
-              <w:t>So the people went out, got the branches, and built themselves little shelters on their roofs, in their courtyards, in the Temple courtyards, and in the public squares by the Water Gate and the Ephraim Gate. The entire group that came back from exile built booths and lived in them. It was wild because the Israelites hadn't done this since the time of Joshua, son of Nun. It was an amazing day, full of incredible joy!</w:t>
+              <w:t>So the people went out, got the branches, and built themselves little shelters on their roofs, in their courtyards, in the courtyards of the Temple of God, and in the public squares by the Water Gate and the Ephraim Gate. The entire group that came back from exile built booths and lived in them. It was wild because the Israelites hadn't done this since the time of Joshua, son of Nun. It was an amazing day, full of incredible joy!</w:t>
             </w:r>
           </w:p>
         </w:tc>
@@ -15938,7 +15938,7 @@
               <w:rPr>
                 <w:sz w:val="18"/>
               </w:rPr>
-              <w:t>Shemaiah (son of Hasshub, who was the son of Azrikam, who was the son of Hashabiah, who was the son of Bunni); Shabbethai and Jozabad, two of the Levite leaders who handled the Temple's external affairs; Mattaniah (son of Mica, who was the son of Zabdi, who was the son of Asaph), the director who led the thanksgiving and prayer time; Bakbukiah, who was second-in-command among his crew; and Abda (son of Shammua, who was the son of Galal, who was the son of Jeduthun). The total number of Levites in the holy city was 284.</w:t>
+              <w:t>Shemaiah (son of Hasshub, who was the son of Azrikam, who was the son of Hashabiah, who was the son of Bunni); Shabbethai and Jozabad, two of the Levite leaders who were in charge of the outside work of the Temple of God; Mattaniah (son of Mica, who was the son of Zabdi, who was the son of Asaph), the director who led the thanksgiving and prayer time; Bakbukiah, who was second-in-command among his crew; and Abda (son of Shammua, who was the son of Galal, who was the son of Jeduthun). The total number of Levites in the holy city was 284.</w:t>
             </w:r>
           </w:p>
         </w:tc>
@@ -23764,7 +23764,7 @@
               <w:rPr>
                 <w:sz w:val="18"/>
               </w:rPr>
-              <w:t>Okay, so a little while before this, this priest named Eliashib was in charge of the Temple's storage rooms. He was close friends with Tobiah and gave him a large room that was supposed to store the grain offerings, incense, worship vessels, and the tithes of grain, wine, and oil for the Levites, singers, and security guards, plus the offerings for the priests.</w:t>
+              <w:t>Okay, so a little while before this, this priest named Eliashib had been put in charge of the storerooms of the Temple of God. He was close friends with Tobiah and gave him a large room that was supposed to store the grain offerings, incense, worship vessels, and the tithes of grain, wine, and oil for the Levites, singers, and security guards, plus the offerings for the priests.</w:t>
             </w:r>
           </w:p>
         </w:tc>
@@ -23787,7 +23787,7 @@
               <w:rPr>
                 <w:sz w:val="18"/>
               </w:rPr>
-              <w:t>이 일이 있기 좀 전에, 엘리아십이라는 제사장이 성전 창고 담당이었거든. 근데 이 사람이 도비야라는 사람이랑 친해가지고, 원래 곡식 제물이랑 향, 예배 도구들, 그리고 레위 사람들이랑 찬양대, 경비원들 월급으로 줘야 할 곡식, 포도주, 기름 십일조랑 제사장들 제물을 보관하던 큰 창고 방을 걔한테 줘버린 거임.</w:t>
+              <w:t>이 일이 있기 좀 전에, 엘리아십이라는 제사장이 하나님의 성전 창고 담당이었거든. 근데 이 사람이 도비야라는 사람이랑 친해가지고, 원래 곡식 제물이랑 향, 예배 도구들, 그리고 레위 사람들이랑 찬양대, 경비원들 월급으로 줘야 할 곡식, 포도주, 기름 십일조랑 제사장들 제물을 보관하던 큰 창고 방을 걔한테 줘버린 거임.</w:t>
             </w:r>
           </w:p>
         </w:tc>
@@ -23835,7 +23835,7 @@
               <w:rPr>
                 <w:sz w:val="18"/>
               </w:rPr>
-              <w:t>I wasn't even in Jerusalem when this was all going down. It was the thirty-second year of King Artaxerxes of Babylon, and I had to go back to see him. But later, I got his permission to leave again. When I got back to Jerusalem, I found out about the messed-up thing Eliashib did, giving Tobiah a room right in the Temple courts. I was so mad, like, beyond angry. I literally threw all of Tobiah's stuff out into the street. Then I ordered them to do a deep clean of the room, and only then did I put all the Temple's sacred items back, along with the offerings and incense.</w:t>
+              <w:t>I wasn't even in Jerusalem when this was all going down. It was the thirty-second year of King Artaxerxes of Babylon, and I had to go back to see him. But later, I got his permission to leave again. When I got back to Jerusalem, I found out about the messed-up thing Eliashib did, giving Tobiah a room right in the courts of the Temple of God. I was so mad, like, beyond angry. I literally threw all of Tobiah's stuff out into the street. Then I ordered them to do a deep clean of the room, and only then did I put all the Temple's sacred items back, along with the offerings and incense.</w:t>
             </w:r>
           </w:p>
         </w:tc>
@@ -23858,7 +23858,7 @@
               <w:rPr>
                 <w:sz w:val="18"/>
               </w:rPr>
-              <w:t>이런 일이 벌어지고 있을 때 나는 예루살렘에 없었어. 바빌론 왕 아닥사스다 32년에 왕한테 다시 돌아갔었거든. 근데 나중에 왕한테 허락받고 다시 예루살렘에 와보니까, 엘리아십이 성전 뜰에 있는 방을 도비야한테 넘겨주는 말도 안 되는 짓을 한 걸 알게 된 거지. 진짜 완전 화나서 도비야 물건들 싹 다 길바닥에 던져버렸어. 그러고 나서 그 방 깨끗하게 정화하라고 명령하고, 그제서야 성전 예배 도구들이랑 곡식 제물이랑 향을 다시 갖다 놨지.</w:t>
+              <w:t>이런 일이 벌어지고 있을 때 나는 예루살렘에 없었어. 바빌론 왕 아닥사스다 32년에 왕한테 다시 돌아갔었거든. 근데 나중에 왕한테 허락받고 다시 예루살렘에 와보니까, 엘리아십이 하나님의 성전 뜰에 있는 방을 도비야한테 넘겨주는 말도 안 되는 짓을 한 걸 알게 된 거지. 진짜 완전 화나서 도비야 물건들 싹 다 길바닥에 던져버렸어. 그러고 나서 그 방 깨끗하게 정화하라고 명령하고, 그제서야 성전 예배 도구들이랑 곡식 제물이랑 향을 다시 갖다 놨지.</w:t>
             </w:r>
           </w:p>
         </w:tc>

</xml_diff>

<commit_message>
Nehemiah 배지 정밀화 (OT 전수조사): 170문단 (EN+KO 340건) — ch7 귀환자 명단 66문단 전면 매핑, ch11/ch12 마을·계보 개별 절화. 독스 13/13 export-back OK.
</commit_message>
<xml_diff>
--- a/gdocs_build/Nehemiah.docx
+++ b/gdocs_build/Nehemiah.docx
@@ -93,7 +93,7 @@
                 <w:b/>
                 <w:sz w:val="16"/>
               </w:rPr>
-              <w:t>1-2</w:t>
+              <w:t>1</w:t>
             </w:r>
           </w:p>
           <w:p>
@@ -124,7 +124,7 @@
                 <w:b/>
                 <w:sz w:val="16"/>
               </w:rPr>
-              <w:t>1-2</w:t>
+              <w:t>1</w:t>
             </w:r>
           </w:p>
           <w:p>
@@ -147,7 +147,7 @@
                 <w:b/>
                 <w:sz w:val="16"/>
               </w:rPr>
-              <w:t>1-2</w:t>
+              <w:t>1</w:t>
             </w:r>
           </w:p>
           <w:p>
@@ -606,7 +606,7 @@
                 <w:b/>
                 <w:sz w:val="16"/>
               </w:rPr>
-              <w:t>10-11</w:t>
+              <w:t>11</w:t>
             </w:r>
           </w:p>
           <w:p>
@@ -629,7 +629,7 @@
                 <w:b/>
                 <w:sz w:val="16"/>
               </w:rPr>
-              <w:t>10-11</w:t>
+              <w:t>11</w:t>
             </w:r>
           </w:p>
           <w:p>
@@ -652,7 +652,7 @@
                 <w:b/>
                 <w:sz w:val="16"/>
               </w:rPr>
-              <w:t>10-11</w:t>
+              <w:t>11</w:t>
             </w:r>
           </w:p>
           <w:p>
@@ -886,7 +886,7 @@
                 <w:b/>
                 <w:sz w:val="16"/>
               </w:rPr>
-              <w:t>4-5</w:t>
+              <w:t>4</w:t>
             </w:r>
           </w:p>
           <w:p>
@@ -917,7 +917,7 @@
                 <w:b/>
                 <w:sz w:val="16"/>
               </w:rPr>
-              <w:t>4-5</w:t>
+              <w:t>4</w:t>
             </w:r>
           </w:p>
           <w:p>
@@ -940,7 +940,7 @@
                 <w:b/>
                 <w:sz w:val="16"/>
               </w:rPr>
-              <w:t>4-5</w:t>
+              <w:t>4</w:t>
             </w:r>
           </w:p>
           <w:p>
@@ -1541,7 +1541,7 @@
                 <w:b/>
                 <w:sz w:val="16"/>
               </w:rPr>
-              <w:t>17-18</w:t>
+              <w:t>17</w:t>
             </w:r>
           </w:p>
           <w:p>
@@ -1572,7 +1572,7 @@
                 <w:b/>
                 <w:sz w:val="16"/>
               </w:rPr>
-              <w:t>17-18</w:t>
+              <w:t>17</w:t>
             </w:r>
           </w:p>
           <w:p>
@@ -1595,7 +1595,7 @@
                 <w:b/>
                 <w:sz w:val="16"/>
               </w:rPr>
-              <w:t>17-18</w:t>
+              <w:t>17</w:t>
             </w:r>
           </w:p>
           <w:p>
@@ -1620,7 +1620,7 @@
                 <w:b/>
                 <w:sz w:val="16"/>
               </w:rPr>
-              <w:t>17-18</w:t>
+              <w:t>18</w:t>
             </w:r>
           </w:p>
           <w:p>
@@ -1643,7 +1643,7 @@
                 <w:b/>
                 <w:sz w:val="16"/>
               </w:rPr>
-              <w:t>17-18</w:t>
+              <w:t>18</w:t>
             </w:r>
           </w:p>
           <w:p>
@@ -1666,7 +1666,7 @@
                 <w:b/>
                 <w:sz w:val="16"/>
               </w:rPr>
-              <w:t>17-18</w:t>
+              <w:t>18</w:t>
             </w:r>
           </w:p>
           <w:p>
@@ -4393,7 +4393,7 @@
                 <w:b/>
                 <w:sz w:val="16"/>
               </w:rPr>
-              <w:t>7-8</w:t>
+              <w:t>8</w:t>
             </w:r>
           </w:p>
           <w:p>
@@ -4416,7 +4416,7 @@
                 <w:b/>
                 <w:sz w:val="16"/>
               </w:rPr>
-              <w:t>7-8</w:t>
+              <w:t>8</w:t>
             </w:r>
           </w:p>
           <w:p>
@@ -4439,7 +4439,7 @@
                 <w:b/>
                 <w:sz w:val="16"/>
               </w:rPr>
-              <w:t>7-8</w:t>
+              <w:t>8</w:t>
             </w:r>
           </w:p>
           <w:p>
@@ -4606,7 +4606,7 @@
                 <w:b/>
                 <w:sz w:val="16"/>
               </w:rPr>
-              <w:t>12-13</w:t>
+              <w:t>12</w:t>
             </w:r>
           </w:p>
           <w:p>
@@ -4645,7 +4645,7 @@
                 <w:b/>
                 <w:sz w:val="16"/>
               </w:rPr>
-              <w:t>12-13</w:t>
+              <w:t>12</w:t>
             </w:r>
           </w:p>
           <w:p>
@@ -4668,7 +4668,7 @@
                 <w:b/>
                 <w:sz w:val="16"/>
               </w:rPr>
-              <w:t>12-13</w:t>
+              <w:t>12</w:t>
             </w:r>
           </w:p>
           <w:p>
@@ -4693,7 +4693,7 @@
                 <w:b/>
                 <w:sz w:val="16"/>
               </w:rPr>
-              <w:t>12-13</w:t>
+              <w:t>13</w:t>
             </w:r>
           </w:p>
           <w:p>
@@ -4716,7 +4716,7 @@
                 <w:b/>
                 <w:sz w:val="16"/>
               </w:rPr>
-              <w:t>12-13</w:t>
+              <w:t>13</w:t>
             </w:r>
           </w:p>
           <w:p>
@@ -4739,7 +4739,7 @@
                 <w:b/>
                 <w:sz w:val="16"/>
               </w:rPr>
-              <w:t>12-13</w:t>
+              <w:t>13</w:t>
             </w:r>
           </w:p>
           <w:p>
@@ -4764,7 +4764,7 @@
                 <w:b/>
                 <w:sz w:val="16"/>
               </w:rPr>
-              <w:t>12-13</w:t>
+              <w:t>13</w:t>
             </w:r>
           </w:p>
           <w:p>
@@ -4787,7 +4787,7 @@
                 <w:b/>
                 <w:sz w:val="16"/>
               </w:rPr>
-              <w:t>12-13</w:t>
+              <w:t>13</w:t>
             </w:r>
           </w:p>
           <w:p>
@@ -4810,7 +4810,7 @@
                 <w:b/>
                 <w:sz w:val="16"/>
               </w:rPr>
-              <w:t>12-13</w:t>
+              <w:t>13</w:t>
             </w:r>
           </w:p>
           <w:p>
@@ -6547,7 +6547,7 @@
                 <w:b/>
                 <w:sz w:val="16"/>
               </w:rPr>
-              <w:t>6-60</w:t>
+              <w:t>6-7</w:t>
             </w:r>
           </w:p>
           <w:p>
@@ -7058,7 +7058,7 @@
                 <w:b/>
                 <w:sz w:val="16"/>
               </w:rPr>
-              <w:t>6-60</w:t>
+              <w:t>6-7</w:t>
             </w:r>
           </w:p>
           <w:p>
@@ -7081,7 +7081,7 @@
                 <w:b/>
                 <w:sz w:val="16"/>
               </w:rPr>
-              <w:t>6-60</w:t>
+              <w:t>6-7</w:t>
             </w:r>
           </w:p>
           <w:p>
@@ -7106,7 +7106,7 @@
                 <w:b/>
                 <w:sz w:val="16"/>
               </w:rPr>
-              <w:t>6-60</w:t>
+              <w:t>8</w:t>
             </w:r>
           </w:p>
           <w:p>
@@ -7129,7 +7129,7 @@
                 <w:b/>
                 <w:sz w:val="16"/>
               </w:rPr>
-              <w:t>6-60</w:t>
+              <w:t>8</w:t>
             </w:r>
           </w:p>
           <w:p>
@@ -7152,7 +7152,7 @@
                 <w:b/>
                 <w:sz w:val="16"/>
               </w:rPr>
-              <w:t>6-60</w:t>
+              <w:t>8</w:t>
             </w:r>
           </w:p>
           <w:p>
@@ -7177,7 +7177,7 @@
                 <w:b/>
                 <w:sz w:val="16"/>
               </w:rPr>
-              <w:t>6-60</w:t>
+              <w:t>8</w:t>
             </w:r>
           </w:p>
           <w:p>
@@ -7200,7 +7200,7 @@
                 <w:b/>
                 <w:sz w:val="16"/>
               </w:rPr>
-              <w:t>6-60</w:t>
+              <w:t>8</w:t>
             </w:r>
           </w:p>
           <w:p>
@@ -7223,7 +7223,7 @@
                 <w:b/>
                 <w:sz w:val="16"/>
               </w:rPr>
-              <w:t>6-60</w:t>
+              <w:t>8</w:t>
             </w:r>
           </w:p>
           <w:p>
@@ -7248,7 +7248,7 @@
                 <w:b/>
                 <w:sz w:val="16"/>
               </w:rPr>
-              <w:t>6-60</w:t>
+              <w:t>9</w:t>
             </w:r>
           </w:p>
           <w:p>
@@ -7271,7 +7271,7 @@
                 <w:b/>
                 <w:sz w:val="16"/>
               </w:rPr>
-              <w:t>6-60</w:t>
+              <w:t>9</w:t>
             </w:r>
           </w:p>
           <w:p>
@@ -7294,7 +7294,7 @@
                 <w:b/>
                 <w:sz w:val="16"/>
               </w:rPr>
-              <w:t>6-60</w:t>
+              <w:t>9</w:t>
             </w:r>
           </w:p>
           <w:p>
@@ -7319,7 +7319,7 @@
                 <w:b/>
                 <w:sz w:val="16"/>
               </w:rPr>
-              <w:t>6-60</w:t>
+              <w:t>10</w:t>
             </w:r>
           </w:p>
           <w:p>
@@ -7342,7 +7342,7 @@
                 <w:b/>
                 <w:sz w:val="16"/>
               </w:rPr>
-              <w:t>6-60</w:t>
+              <w:t>10</w:t>
             </w:r>
           </w:p>
           <w:p>
@@ -7365,7 +7365,7 @@
                 <w:b/>
                 <w:sz w:val="16"/>
               </w:rPr>
-              <w:t>6-60</w:t>
+              <w:t>10</w:t>
             </w:r>
           </w:p>
           <w:p>
@@ -7390,7 +7390,7 @@
                 <w:b/>
                 <w:sz w:val="16"/>
               </w:rPr>
-              <w:t>6-60</w:t>
+              <w:t>11</w:t>
             </w:r>
           </w:p>
           <w:p>
@@ -7413,7 +7413,7 @@
                 <w:b/>
                 <w:sz w:val="16"/>
               </w:rPr>
-              <w:t>6-60</w:t>
+              <w:t>11</w:t>
             </w:r>
           </w:p>
           <w:p>
@@ -7436,7 +7436,7 @@
                 <w:b/>
                 <w:sz w:val="16"/>
               </w:rPr>
-              <w:t>6-60</w:t>
+              <w:t>11</w:t>
             </w:r>
           </w:p>
           <w:p>
@@ -7461,7 +7461,7 @@
                 <w:b/>
                 <w:sz w:val="16"/>
               </w:rPr>
-              <w:t>6-60</w:t>
+              <w:t>12</w:t>
             </w:r>
           </w:p>
           <w:p>
@@ -7484,7 +7484,7 @@
                 <w:b/>
                 <w:sz w:val="16"/>
               </w:rPr>
-              <w:t>6-60</w:t>
+              <w:t>12</w:t>
             </w:r>
           </w:p>
           <w:p>
@@ -7507,7 +7507,7 @@
                 <w:b/>
                 <w:sz w:val="16"/>
               </w:rPr>
-              <w:t>6-60</w:t>
+              <w:t>12</w:t>
             </w:r>
           </w:p>
           <w:p>
@@ -7532,7 +7532,7 @@
                 <w:b/>
                 <w:sz w:val="16"/>
               </w:rPr>
-              <w:t>6-60</w:t>
+              <w:t>13</w:t>
             </w:r>
           </w:p>
           <w:p>
@@ -7555,7 +7555,7 @@
                 <w:b/>
                 <w:sz w:val="16"/>
               </w:rPr>
-              <w:t>6-60</w:t>
+              <w:t>13</w:t>
             </w:r>
           </w:p>
           <w:p>
@@ -7578,7 +7578,7 @@
                 <w:b/>
                 <w:sz w:val="16"/>
               </w:rPr>
-              <w:t>6-60</w:t>
+              <w:t>13</w:t>
             </w:r>
           </w:p>
           <w:p>
@@ -7603,7 +7603,7 @@
                 <w:b/>
                 <w:sz w:val="16"/>
               </w:rPr>
-              <w:t>6-60</w:t>
+              <w:t>14</w:t>
             </w:r>
           </w:p>
           <w:p>
@@ -7626,7 +7626,7 @@
                 <w:b/>
                 <w:sz w:val="16"/>
               </w:rPr>
-              <w:t>6-60</w:t>
+              <w:t>14</w:t>
             </w:r>
           </w:p>
           <w:p>
@@ -7649,7 +7649,7 @@
                 <w:b/>
                 <w:sz w:val="16"/>
               </w:rPr>
-              <w:t>6-60</w:t>
+              <w:t>14</w:t>
             </w:r>
           </w:p>
           <w:p>
@@ -7674,7 +7674,7 @@
                 <w:b/>
                 <w:sz w:val="16"/>
               </w:rPr>
-              <w:t>6-60</w:t>
+              <w:t>15</w:t>
             </w:r>
           </w:p>
           <w:p>
@@ -7697,7 +7697,7 @@
                 <w:b/>
                 <w:sz w:val="16"/>
               </w:rPr>
-              <w:t>6-60</w:t>
+              <w:t>15</w:t>
             </w:r>
           </w:p>
           <w:p>
@@ -7720,7 +7720,7 @@
                 <w:b/>
                 <w:sz w:val="16"/>
               </w:rPr>
-              <w:t>6-60</w:t>
+              <w:t>15</w:t>
             </w:r>
           </w:p>
           <w:p>
@@ -7745,7 +7745,7 @@
                 <w:b/>
                 <w:sz w:val="16"/>
               </w:rPr>
-              <w:t>6-60</w:t>
+              <w:t>16</w:t>
             </w:r>
           </w:p>
           <w:p>
@@ -7768,7 +7768,7 @@
                 <w:b/>
                 <w:sz w:val="16"/>
               </w:rPr>
-              <w:t>6-60</w:t>
+              <w:t>16</w:t>
             </w:r>
           </w:p>
           <w:p>
@@ -7791,7 +7791,7 @@
                 <w:b/>
                 <w:sz w:val="16"/>
               </w:rPr>
-              <w:t>6-60</w:t>
+              <w:t>16</w:t>
             </w:r>
           </w:p>
           <w:p>
@@ -7816,7 +7816,7 @@
                 <w:b/>
                 <w:sz w:val="16"/>
               </w:rPr>
-              <w:t>6-60</w:t>
+              <w:t>17</w:t>
             </w:r>
           </w:p>
           <w:p>
@@ -7839,7 +7839,7 @@
                 <w:b/>
                 <w:sz w:val="16"/>
               </w:rPr>
-              <w:t>6-60</w:t>
+              <w:t>17</w:t>
             </w:r>
           </w:p>
           <w:p>
@@ -7862,7 +7862,7 @@
                 <w:b/>
                 <w:sz w:val="16"/>
               </w:rPr>
-              <w:t>6-60</w:t>
+              <w:t>17</w:t>
             </w:r>
           </w:p>
           <w:p>
@@ -7887,7 +7887,7 @@
                 <w:b/>
                 <w:sz w:val="16"/>
               </w:rPr>
-              <w:t>6-60</w:t>
+              <w:t>18</w:t>
             </w:r>
           </w:p>
           <w:p>
@@ -7910,7 +7910,7 @@
                 <w:b/>
                 <w:sz w:val="16"/>
               </w:rPr>
-              <w:t>6-60</w:t>
+              <w:t>18</w:t>
             </w:r>
           </w:p>
           <w:p>
@@ -7933,7 +7933,7 @@
                 <w:b/>
                 <w:sz w:val="16"/>
               </w:rPr>
-              <w:t>6-60</w:t>
+              <w:t>18</w:t>
             </w:r>
           </w:p>
           <w:p>
@@ -7958,7 +7958,7 @@
                 <w:b/>
                 <w:sz w:val="16"/>
               </w:rPr>
-              <w:t>6-60</w:t>
+              <w:t>19</w:t>
             </w:r>
           </w:p>
           <w:p>
@@ -7981,7 +7981,7 @@
                 <w:b/>
                 <w:sz w:val="16"/>
               </w:rPr>
-              <w:t>6-60</w:t>
+              <w:t>19</w:t>
             </w:r>
           </w:p>
           <w:p>
@@ -8004,7 +8004,7 @@
                 <w:b/>
                 <w:sz w:val="16"/>
               </w:rPr>
-              <w:t>6-60</w:t>
+              <w:t>19</w:t>
             </w:r>
           </w:p>
           <w:p>
@@ -8029,7 +8029,7 @@
                 <w:b/>
                 <w:sz w:val="16"/>
               </w:rPr>
-              <w:t>6-60</w:t>
+              <w:t>20</w:t>
             </w:r>
           </w:p>
           <w:p>
@@ -8052,7 +8052,7 @@
                 <w:b/>
                 <w:sz w:val="16"/>
               </w:rPr>
-              <w:t>6-60</w:t>
+              <w:t>20</w:t>
             </w:r>
           </w:p>
           <w:p>
@@ -8075,7 +8075,7 @@
                 <w:b/>
                 <w:sz w:val="16"/>
               </w:rPr>
-              <w:t>6-60</w:t>
+              <w:t>20</w:t>
             </w:r>
           </w:p>
           <w:p>
@@ -8100,7 +8100,7 @@
                 <w:b/>
                 <w:sz w:val="16"/>
               </w:rPr>
-              <w:t>6-60</w:t>
+              <w:t>21</w:t>
             </w:r>
           </w:p>
           <w:p>
@@ -8123,7 +8123,7 @@
                 <w:b/>
                 <w:sz w:val="16"/>
               </w:rPr>
-              <w:t>6-60</w:t>
+              <w:t>21</w:t>
             </w:r>
           </w:p>
           <w:p>
@@ -8146,7 +8146,7 @@
                 <w:b/>
                 <w:sz w:val="16"/>
               </w:rPr>
-              <w:t>6-60</w:t>
+              <w:t>21</w:t>
             </w:r>
           </w:p>
           <w:p>
@@ -8171,7 +8171,7 @@
                 <w:b/>
                 <w:sz w:val="16"/>
               </w:rPr>
-              <w:t>6-60</w:t>
+              <w:t>22</w:t>
             </w:r>
           </w:p>
           <w:p>
@@ -8194,7 +8194,7 @@
                 <w:b/>
                 <w:sz w:val="16"/>
               </w:rPr>
-              <w:t>6-60</w:t>
+              <w:t>22</w:t>
             </w:r>
           </w:p>
           <w:p>
@@ -8217,7 +8217,7 @@
                 <w:b/>
                 <w:sz w:val="16"/>
               </w:rPr>
-              <w:t>6-60</w:t>
+              <w:t>22</w:t>
             </w:r>
           </w:p>
           <w:p>
@@ -8242,7 +8242,7 @@
                 <w:b/>
                 <w:sz w:val="16"/>
               </w:rPr>
-              <w:t>6-60</w:t>
+              <w:t>23</w:t>
             </w:r>
           </w:p>
           <w:p>
@@ -8265,7 +8265,7 @@
                 <w:b/>
                 <w:sz w:val="16"/>
               </w:rPr>
-              <w:t>6-60</w:t>
+              <w:t>23</w:t>
             </w:r>
           </w:p>
           <w:p>
@@ -8288,7 +8288,7 @@
                 <w:b/>
                 <w:sz w:val="16"/>
               </w:rPr>
-              <w:t>6-60</w:t>
+              <w:t>23</w:t>
             </w:r>
           </w:p>
           <w:p>
@@ -8313,7 +8313,7 @@
                 <w:b/>
                 <w:sz w:val="16"/>
               </w:rPr>
-              <w:t>6-60</w:t>
+              <w:t>24</w:t>
             </w:r>
           </w:p>
           <w:p>
@@ -8336,7 +8336,7 @@
                 <w:b/>
                 <w:sz w:val="16"/>
               </w:rPr>
-              <w:t>6-60</w:t>
+              <w:t>24</w:t>
             </w:r>
           </w:p>
           <w:p>
@@ -8359,7 +8359,7 @@
                 <w:b/>
                 <w:sz w:val="16"/>
               </w:rPr>
-              <w:t>6-60</w:t>
+              <w:t>24</w:t>
             </w:r>
           </w:p>
           <w:p>
@@ -8384,7 +8384,7 @@
                 <w:b/>
                 <w:sz w:val="16"/>
               </w:rPr>
-              <w:t>6-60</w:t>
+              <w:t>25</w:t>
             </w:r>
           </w:p>
           <w:p>
@@ -8407,7 +8407,7 @@
                 <w:b/>
                 <w:sz w:val="16"/>
               </w:rPr>
-              <w:t>6-60</w:t>
+              <w:t>25</w:t>
             </w:r>
           </w:p>
           <w:p>
@@ -8430,7 +8430,7 @@
                 <w:b/>
                 <w:sz w:val="16"/>
               </w:rPr>
-              <w:t>6-60</w:t>
+              <w:t>25</w:t>
             </w:r>
           </w:p>
           <w:p>
@@ -8455,7 +8455,7 @@
                 <w:b/>
                 <w:sz w:val="16"/>
               </w:rPr>
-              <w:t>6-60</w:t>
+              <w:t>26</w:t>
             </w:r>
           </w:p>
           <w:p>
@@ -8478,7 +8478,7 @@
                 <w:b/>
                 <w:sz w:val="16"/>
               </w:rPr>
-              <w:t>6-60</w:t>
+              <w:t>26</w:t>
             </w:r>
           </w:p>
           <w:p>
@@ -8501,7 +8501,7 @@
                 <w:b/>
                 <w:sz w:val="16"/>
               </w:rPr>
-              <w:t>6-60</w:t>
+              <w:t>26</w:t>
             </w:r>
           </w:p>
           <w:p>
@@ -8526,7 +8526,7 @@
                 <w:b/>
                 <w:sz w:val="16"/>
               </w:rPr>
-              <w:t>6-60</w:t>
+              <w:t>26</w:t>
             </w:r>
           </w:p>
           <w:p>
@@ -8549,7 +8549,7 @@
                 <w:b/>
                 <w:sz w:val="16"/>
               </w:rPr>
-              <w:t>6-60</w:t>
+              <w:t>26</w:t>
             </w:r>
           </w:p>
           <w:p>
@@ -8572,7 +8572,7 @@
                 <w:b/>
                 <w:sz w:val="16"/>
               </w:rPr>
-              <w:t>6-60</w:t>
+              <w:t>26</w:t>
             </w:r>
           </w:p>
           <w:p>
@@ -8597,7 +8597,7 @@
                 <w:b/>
                 <w:sz w:val="16"/>
               </w:rPr>
-              <w:t>6-60</w:t>
+              <w:t>27</w:t>
             </w:r>
           </w:p>
           <w:p>
@@ -8620,7 +8620,7 @@
                 <w:b/>
                 <w:sz w:val="16"/>
               </w:rPr>
-              <w:t>6-60</w:t>
+              <w:t>27</w:t>
             </w:r>
           </w:p>
           <w:p>
@@ -8643,7 +8643,7 @@
                 <w:b/>
                 <w:sz w:val="16"/>
               </w:rPr>
-              <w:t>6-60</w:t>
+              <w:t>27</w:t>
             </w:r>
           </w:p>
           <w:p>
@@ -8668,7 +8668,7 @@
                 <w:b/>
                 <w:sz w:val="16"/>
               </w:rPr>
-              <w:t>6-60</w:t>
+              <w:t>28</w:t>
             </w:r>
           </w:p>
           <w:p>
@@ -8691,7 +8691,7 @@
                 <w:b/>
                 <w:sz w:val="16"/>
               </w:rPr>
-              <w:t>6-60</w:t>
+              <w:t>28</w:t>
             </w:r>
           </w:p>
           <w:p>
@@ -8714,7 +8714,7 @@
                 <w:b/>
                 <w:sz w:val="16"/>
               </w:rPr>
-              <w:t>6-60</w:t>
+              <w:t>28</w:t>
             </w:r>
           </w:p>
           <w:p>
@@ -8739,7 +8739,7 @@
                 <w:b/>
                 <w:sz w:val="16"/>
               </w:rPr>
-              <w:t>6-60</w:t>
+              <w:t>29</w:t>
             </w:r>
           </w:p>
           <w:p>
@@ -8762,7 +8762,7 @@
                 <w:b/>
                 <w:sz w:val="16"/>
               </w:rPr>
-              <w:t>6-60</w:t>
+              <w:t>29</w:t>
             </w:r>
           </w:p>
           <w:p>
@@ -8785,7 +8785,7 @@
                 <w:b/>
                 <w:sz w:val="16"/>
               </w:rPr>
-              <w:t>6-60</w:t>
+              <w:t>29</w:t>
             </w:r>
           </w:p>
           <w:p>
@@ -8810,7 +8810,7 @@
                 <w:b/>
                 <w:sz w:val="16"/>
               </w:rPr>
-              <w:t>6-60</w:t>
+              <w:t>30</w:t>
             </w:r>
           </w:p>
           <w:p>
@@ -8833,7 +8833,7 @@
                 <w:b/>
                 <w:sz w:val="16"/>
               </w:rPr>
-              <w:t>6-60</w:t>
+              <w:t>30</w:t>
             </w:r>
           </w:p>
           <w:p>
@@ -8856,7 +8856,7 @@
                 <w:b/>
                 <w:sz w:val="16"/>
               </w:rPr>
-              <w:t>6-60</w:t>
+              <w:t>30</w:t>
             </w:r>
           </w:p>
           <w:p>
@@ -8881,7 +8881,7 @@
                 <w:b/>
                 <w:sz w:val="16"/>
               </w:rPr>
-              <w:t>6-60</w:t>
+              <w:t>31</w:t>
             </w:r>
           </w:p>
           <w:p>
@@ -8904,7 +8904,7 @@
                 <w:b/>
                 <w:sz w:val="16"/>
               </w:rPr>
-              <w:t>6-60</w:t>
+              <w:t>31</w:t>
             </w:r>
           </w:p>
           <w:p>
@@ -8927,7 +8927,7 @@
                 <w:b/>
                 <w:sz w:val="16"/>
               </w:rPr>
-              <w:t>6-60</w:t>
+              <w:t>31</w:t>
             </w:r>
           </w:p>
           <w:p>
@@ -8952,7 +8952,7 @@
                 <w:b/>
                 <w:sz w:val="16"/>
               </w:rPr>
-              <w:t>6-60</w:t>
+              <w:t>32</w:t>
             </w:r>
           </w:p>
           <w:p>
@@ -8975,7 +8975,7 @@
                 <w:b/>
                 <w:sz w:val="16"/>
               </w:rPr>
-              <w:t>6-60</w:t>
+              <w:t>32</w:t>
             </w:r>
           </w:p>
           <w:p>
@@ -8998,7 +8998,7 @@
                 <w:b/>
                 <w:sz w:val="16"/>
               </w:rPr>
-              <w:t>6-60</w:t>
+              <w:t>32</w:t>
             </w:r>
           </w:p>
           <w:p>
@@ -9023,7 +9023,7 @@
                 <w:b/>
                 <w:sz w:val="16"/>
               </w:rPr>
-              <w:t>6-60</w:t>
+              <w:t>33</w:t>
             </w:r>
           </w:p>
           <w:p>
@@ -9046,7 +9046,7 @@
                 <w:b/>
                 <w:sz w:val="16"/>
               </w:rPr>
-              <w:t>6-60</w:t>
+              <w:t>33</w:t>
             </w:r>
           </w:p>
           <w:p>
@@ -9069,7 +9069,7 @@
                 <w:b/>
                 <w:sz w:val="16"/>
               </w:rPr>
-              <w:t>6-60</w:t>
+              <w:t>33</w:t>
             </w:r>
           </w:p>
           <w:p>
@@ -9094,7 +9094,7 @@
                 <w:b/>
                 <w:sz w:val="16"/>
               </w:rPr>
-              <w:t>6-60</w:t>
+              <w:t>34</w:t>
             </w:r>
           </w:p>
           <w:p>
@@ -9117,7 +9117,7 @@
                 <w:b/>
                 <w:sz w:val="16"/>
               </w:rPr>
-              <w:t>6-60</w:t>
+              <w:t>34</w:t>
             </w:r>
           </w:p>
           <w:p>
@@ -9140,7 +9140,7 @@
                 <w:b/>
                 <w:sz w:val="16"/>
               </w:rPr>
-              <w:t>6-60</w:t>
+              <w:t>34</w:t>
             </w:r>
           </w:p>
           <w:p>
@@ -9165,7 +9165,7 @@
                 <w:b/>
                 <w:sz w:val="16"/>
               </w:rPr>
-              <w:t>6-60</w:t>
+              <w:t>35</w:t>
             </w:r>
           </w:p>
           <w:p>
@@ -9188,7 +9188,7 @@
                 <w:b/>
                 <w:sz w:val="16"/>
               </w:rPr>
-              <w:t>6-60</w:t>
+              <w:t>35</w:t>
             </w:r>
           </w:p>
           <w:p>
@@ -9211,7 +9211,7 @@
                 <w:b/>
                 <w:sz w:val="16"/>
               </w:rPr>
-              <w:t>6-60</w:t>
+              <w:t>35</w:t>
             </w:r>
           </w:p>
           <w:p>
@@ -9236,7 +9236,7 @@
                 <w:b/>
                 <w:sz w:val="16"/>
               </w:rPr>
-              <w:t>6-60</w:t>
+              <w:t>36</w:t>
             </w:r>
           </w:p>
           <w:p>
@@ -9259,7 +9259,7 @@
                 <w:b/>
                 <w:sz w:val="16"/>
               </w:rPr>
-              <w:t>6-60</w:t>
+              <w:t>36</w:t>
             </w:r>
           </w:p>
           <w:p>
@@ -9282,7 +9282,7 @@
                 <w:b/>
                 <w:sz w:val="16"/>
               </w:rPr>
-              <w:t>6-60</w:t>
+              <w:t>36</w:t>
             </w:r>
           </w:p>
           <w:p>
@@ -9307,7 +9307,7 @@
                 <w:b/>
                 <w:sz w:val="16"/>
               </w:rPr>
-              <w:t>6-60</w:t>
+              <w:t>37</w:t>
             </w:r>
           </w:p>
           <w:p>
@@ -9330,7 +9330,7 @@
                 <w:b/>
                 <w:sz w:val="16"/>
               </w:rPr>
-              <w:t>6-60</w:t>
+              <w:t>37</w:t>
             </w:r>
           </w:p>
           <w:p>
@@ -9353,7 +9353,7 @@
                 <w:b/>
                 <w:sz w:val="16"/>
               </w:rPr>
-              <w:t>6-60</w:t>
+              <w:t>37</w:t>
             </w:r>
           </w:p>
           <w:p>
@@ -9378,7 +9378,7 @@
                 <w:b/>
                 <w:sz w:val="16"/>
               </w:rPr>
-              <w:t>6-60</w:t>
+              <w:t>38</w:t>
             </w:r>
           </w:p>
           <w:p>
@@ -9401,7 +9401,7 @@
                 <w:b/>
                 <w:sz w:val="16"/>
               </w:rPr>
-              <w:t>6-60</w:t>
+              <w:t>38</w:t>
             </w:r>
           </w:p>
           <w:p>
@@ -9424,7 +9424,7 @@
                 <w:b/>
                 <w:sz w:val="16"/>
               </w:rPr>
-              <w:t>6-60</w:t>
+              <w:t>38</w:t>
             </w:r>
           </w:p>
           <w:p>
@@ -9449,7 +9449,7 @@
                 <w:b/>
                 <w:sz w:val="16"/>
               </w:rPr>
-              <w:t>6-60</w:t>
+              <w:t>39</w:t>
             </w:r>
           </w:p>
           <w:p>
@@ -9472,7 +9472,7 @@
                 <w:b/>
                 <w:sz w:val="16"/>
               </w:rPr>
-              <w:t>6-60</w:t>
+              <w:t>39</w:t>
             </w:r>
           </w:p>
           <w:p>
@@ -9495,7 +9495,7 @@
                 <w:b/>
                 <w:sz w:val="16"/>
               </w:rPr>
-              <w:t>6-60</w:t>
+              <w:t>39</w:t>
             </w:r>
           </w:p>
           <w:p>
@@ -9520,7 +9520,7 @@
                 <w:b/>
                 <w:sz w:val="16"/>
               </w:rPr>
-              <w:t>6-60</w:t>
+              <w:t>39</w:t>
             </w:r>
           </w:p>
           <w:p>
@@ -9543,7 +9543,7 @@
                 <w:b/>
                 <w:sz w:val="16"/>
               </w:rPr>
-              <w:t>6-60</w:t>
+              <w:t>39</w:t>
             </w:r>
           </w:p>
           <w:p>
@@ -9566,7 +9566,7 @@
                 <w:b/>
                 <w:sz w:val="16"/>
               </w:rPr>
-              <w:t>6-60</w:t>
+              <w:t>39</w:t>
             </w:r>
           </w:p>
           <w:p>
@@ -9591,7 +9591,7 @@
                 <w:b/>
                 <w:sz w:val="16"/>
               </w:rPr>
-              <w:t>6-60</w:t>
+              <w:t>40</w:t>
             </w:r>
           </w:p>
           <w:p>
@@ -9614,7 +9614,7 @@
                 <w:b/>
                 <w:sz w:val="16"/>
               </w:rPr>
-              <w:t>6-60</w:t>
+              <w:t>40</w:t>
             </w:r>
           </w:p>
           <w:p>
@@ -9637,7 +9637,7 @@
                 <w:b/>
                 <w:sz w:val="16"/>
               </w:rPr>
-              <w:t>6-60</w:t>
+              <w:t>40</w:t>
             </w:r>
           </w:p>
           <w:p>
@@ -9662,7 +9662,7 @@
                 <w:b/>
                 <w:sz w:val="16"/>
               </w:rPr>
-              <w:t>6-60</w:t>
+              <w:t>41</w:t>
             </w:r>
           </w:p>
           <w:p>
@@ -9685,7 +9685,7 @@
                 <w:b/>
                 <w:sz w:val="16"/>
               </w:rPr>
-              <w:t>6-60</w:t>
+              <w:t>41</w:t>
             </w:r>
           </w:p>
           <w:p>
@@ -9708,7 +9708,7 @@
                 <w:b/>
                 <w:sz w:val="16"/>
               </w:rPr>
-              <w:t>6-60</w:t>
+              <w:t>41</w:t>
             </w:r>
           </w:p>
           <w:p>
@@ -9733,7 +9733,7 @@
                 <w:b/>
                 <w:sz w:val="16"/>
               </w:rPr>
-              <w:t>6-60</w:t>
+              <w:t>42</w:t>
             </w:r>
           </w:p>
           <w:p>
@@ -9756,7 +9756,7 @@
                 <w:b/>
                 <w:sz w:val="16"/>
               </w:rPr>
-              <w:t>6-60</w:t>
+              <w:t>42</w:t>
             </w:r>
           </w:p>
           <w:p>
@@ -9779,7 +9779,7 @@
                 <w:b/>
                 <w:sz w:val="16"/>
               </w:rPr>
-              <w:t>6-60</w:t>
+              <w:t>42</w:t>
             </w:r>
           </w:p>
           <w:p>
@@ -9804,7 +9804,7 @@
                 <w:b/>
                 <w:sz w:val="16"/>
               </w:rPr>
-              <w:t>6-60</w:t>
+              <w:t>43</w:t>
             </w:r>
           </w:p>
           <w:p>
@@ -9827,7 +9827,7 @@
                 <w:b/>
                 <w:sz w:val="16"/>
               </w:rPr>
-              <w:t>6-60</w:t>
+              <w:t>43</w:t>
             </w:r>
           </w:p>
           <w:p>
@@ -9850,7 +9850,7 @@
                 <w:b/>
                 <w:sz w:val="16"/>
               </w:rPr>
-              <w:t>6-60</w:t>
+              <w:t>43</w:t>
             </w:r>
           </w:p>
           <w:p>
@@ -9875,7 +9875,7 @@
                 <w:b/>
                 <w:sz w:val="16"/>
               </w:rPr>
-              <w:t>6-60</w:t>
+              <w:t>43</w:t>
             </w:r>
           </w:p>
           <w:p>
@@ -9898,7 +9898,7 @@
                 <w:b/>
                 <w:sz w:val="16"/>
               </w:rPr>
-              <w:t>6-60</w:t>
+              <w:t>43</w:t>
             </w:r>
           </w:p>
           <w:p>
@@ -9921,7 +9921,7 @@
                 <w:b/>
                 <w:sz w:val="16"/>
               </w:rPr>
-              <w:t>6-60</w:t>
+              <w:t>43</w:t>
             </w:r>
           </w:p>
           <w:p>
@@ -9946,7 +9946,7 @@
                 <w:b/>
                 <w:sz w:val="16"/>
               </w:rPr>
-              <w:t>6-60</w:t>
+              <w:t>44</w:t>
             </w:r>
           </w:p>
           <w:p>
@@ -9969,7 +9969,7 @@
                 <w:b/>
                 <w:sz w:val="16"/>
               </w:rPr>
-              <w:t>6-60</w:t>
+              <w:t>44</w:t>
             </w:r>
           </w:p>
           <w:p>
@@ -9992,7 +9992,7 @@
                 <w:b/>
                 <w:sz w:val="16"/>
               </w:rPr>
-              <w:t>6-60</w:t>
+              <w:t>44</w:t>
             </w:r>
           </w:p>
           <w:p>
@@ -10017,7 +10017,7 @@
                 <w:b/>
                 <w:sz w:val="16"/>
               </w:rPr>
-              <w:t>6-60</w:t>
+              <w:t>44</w:t>
             </w:r>
           </w:p>
           <w:p>
@@ -10040,7 +10040,7 @@
                 <w:b/>
                 <w:sz w:val="16"/>
               </w:rPr>
-              <w:t>6-60</w:t>
+              <w:t>44</w:t>
             </w:r>
           </w:p>
           <w:p>
@@ -10063,7 +10063,7 @@
                 <w:b/>
                 <w:sz w:val="16"/>
               </w:rPr>
-              <w:t>6-60</w:t>
+              <w:t>44</w:t>
             </w:r>
           </w:p>
           <w:p>
@@ -10088,7 +10088,7 @@
                 <w:b/>
                 <w:sz w:val="16"/>
               </w:rPr>
-              <w:t>6-60</w:t>
+              <w:t>45</w:t>
             </w:r>
           </w:p>
           <w:p>
@@ -10111,7 +10111,7 @@
                 <w:b/>
                 <w:sz w:val="16"/>
               </w:rPr>
-              <w:t>6-60</w:t>
+              <w:t>45</w:t>
             </w:r>
           </w:p>
           <w:p>
@@ -10134,7 +10134,7 @@
                 <w:b/>
                 <w:sz w:val="16"/>
               </w:rPr>
-              <w:t>6-60</w:t>
+              <w:t>45</w:t>
             </w:r>
           </w:p>
           <w:p>
@@ -10159,7 +10159,7 @@
                 <w:b/>
                 <w:sz w:val="16"/>
               </w:rPr>
-              <w:t>6-60</w:t>
+              <w:t>45</w:t>
             </w:r>
           </w:p>
           <w:p>
@@ -10182,7 +10182,7 @@
                 <w:b/>
                 <w:sz w:val="16"/>
               </w:rPr>
-              <w:t>6-60</w:t>
+              <w:t>45</w:t>
             </w:r>
           </w:p>
           <w:p>
@@ -10205,7 +10205,7 @@
                 <w:b/>
                 <w:sz w:val="16"/>
               </w:rPr>
-              <w:t>6-60</w:t>
+              <w:t>45</w:t>
             </w:r>
           </w:p>
           <w:p>
@@ -10230,7 +10230,7 @@
                 <w:b/>
                 <w:sz w:val="16"/>
               </w:rPr>
-              <w:t>6-60</w:t>
+              <w:t>46</w:t>
             </w:r>
           </w:p>
           <w:p>
@@ -10253,7 +10253,7 @@
                 <w:b/>
                 <w:sz w:val="16"/>
               </w:rPr>
-              <w:t>6-60</w:t>
+              <w:t>46</w:t>
             </w:r>
           </w:p>
           <w:p>
@@ -10276,7 +10276,7 @@
                 <w:b/>
                 <w:sz w:val="16"/>
               </w:rPr>
-              <w:t>6-60</w:t>
+              <w:t>46</w:t>
             </w:r>
           </w:p>
           <w:p>
@@ -10301,7 +10301,7 @@
                 <w:b/>
                 <w:sz w:val="16"/>
               </w:rPr>
-              <w:t>6-60</w:t>
+              <w:t>46</w:t>
             </w:r>
           </w:p>
           <w:p>
@@ -10324,7 +10324,7 @@
                 <w:b/>
                 <w:sz w:val="16"/>
               </w:rPr>
-              <w:t>6-60</w:t>
+              <w:t>46</w:t>
             </w:r>
           </w:p>
           <w:p>
@@ -10347,7 +10347,7 @@
                 <w:b/>
                 <w:sz w:val="16"/>
               </w:rPr>
-              <w:t>6-60</w:t>
+              <w:t>46</w:t>
             </w:r>
           </w:p>
           <w:p>
@@ -10372,7 +10372,7 @@
                 <w:b/>
                 <w:sz w:val="16"/>
               </w:rPr>
-              <w:t>6-60</w:t>
+              <w:t>47</w:t>
             </w:r>
           </w:p>
           <w:p>
@@ -10395,7 +10395,7 @@
                 <w:b/>
                 <w:sz w:val="16"/>
               </w:rPr>
-              <w:t>6-60</w:t>
+              <w:t>47</w:t>
             </w:r>
           </w:p>
           <w:p>
@@ -10418,7 +10418,7 @@
                 <w:b/>
                 <w:sz w:val="16"/>
               </w:rPr>
-              <w:t>6-60</w:t>
+              <w:t>47</w:t>
             </w:r>
           </w:p>
           <w:p>
@@ -10443,7 +10443,7 @@
                 <w:b/>
                 <w:sz w:val="16"/>
               </w:rPr>
-              <w:t>6-60</w:t>
+              <w:t>48</w:t>
             </w:r>
           </w:p>
           <w:p>
@@ -10466,7 +10466,7 @@
                 <w:b/>
                 <w:sz w:val="16"/>
               </w:rPr>
-              <w:t>6-60</w:t>
+              <w:t>48</w:t>
             </w:r>
           </w:p>
           <w:p>
@@ -10489,7 +10489,7 @@
                 <w:b/>
                 <w:sz w:val="16"/>
               </w:rPr>
-              <w:t>6-60</w:t>
+              <w:t>48</w:t>
             </w:r>
           </w:p>
           <w:p>
@@ -10514,7 +10514,7 @@
                 <w:b/>
                 <w:sz w:val="16"/>
               </w:rPr>
-              <w:t>6-60</w:t>
+              <w:t>49</w:t>
             </w:r>
           </w:p>
           <w:p>
@@ -10537,7 +10537,7 @@
                 <w:b/>
                 <w:sz w:val="16"/>
               </w:rPr>
-              <w:t>6-60</w:t>
+              <w:t>49</w:t>
             </w:r>
           </w:p>
           <w:p>
@@ -10560,7 +10560,7 @@
                 <w:b/>
                 <w:sz w:val="16"/>
               </w:rPr>
-              <w:t>6-60</w:t>
+              <w:t>49</w:t>
             </w:r>
           </w:p>
           <w:p>
@@ -10585,7 +10585,7 @@
                 <w:b/>
                 <w:sz w:val="16"/>
               </w:rPr>
-              <w:t>6-60</w:t>
+              <w:t>50</w:t>
             </w:r>
           </w:p>
           <w:p>
@@ -10608,7 +10608,7 @@
                 <w:b/>
                 <w:sz w:val="16"/>
               </w:rPr>
-              <w:t>6-60</w:t>
+              <w:t>50</w:t>
             </w:r>
           </w:p>
           <w:p>
@@ -10631,7 +10631,7 @@
                 <w:b/>
                 <w:sz w:val="16"/>
               </w:rPr>
-              <w:t>6-60</w:t>
+              <w:t>50</w:t>
             </w:r>
           </w:p>
           <w:p>
@@ -10656,7 +10656,7 @@
                 <w:b/>
                 <w:sz w:val="16"/>
               </w:rPr>
-              <w:t>6-60</w:t>
+              <w:t>51</w:t>
             </w:r>
           </w:p>
           <w:p>
@@ -10679,7 +10679,7 @@
                 <w:b/>
                 <w:sz w:val="16"/>
               </w:rPr>
-              <w:t>6-60</w:t>
+              <w:t>51</w:t>
             </w:r>
           </w:p>
           <w:p>
@@ -10702,7 +10702,7 @@
                 <w:b/>
                 <w:sz w:val="16"/>
               </w:rPr>
-              <w:t>6-60</w:t>
+              <w:t>51</w:t>
             </w:r>
           </w:p>
           <w:p>
@@ -10727,7 +10727,7 @@
                 <w:b/>
                 <w:sz w:val="16"/>
               </w:rPr>
-              <w:t>6-60</w:t>
+              <w:t>52</w:t>
             </w:r>
           </w:p>
           <w:p>
@@ -10750,7 +10750,7 @@
                 <w:b/>
                 <w:sz w:val="16"/>
               </w:rPr>
-              <w:t>6-60</w:t>
+              <w:t>52</w:t>
             </w:r>
           </w:p>
           <w:p>
@@ -10773,7 +10773,7 @@
                 <w:b/>
                 <w:sz w:val="16"/>
               </w:rPr>
-              <w:t>6-60</w:t>
+              <w:t>52</w:t>
             </w:r>
           </w:p>
           <w:p>
@@ -10798,7 +10798,7 @@
                 <w:b/>
                 <w:sz w:val="16"/>
               </w:rPr>
-              <w:t>6-60</w:t>
+              <w:t>53</w:t>
             </w:r>
           </w:p>
           <w:p>
@@ -10821,7 +10821,7 @@
                 <w:b/>
                 <w:sz w:val="16"/>
               </w:rPr>
-              <w:t>6-60</w:t>
+              <w:t>53</w:t>
             </w:r>
           </w:p>
           <w:p>
@@ -10844,7 +10844,7 @@
                 <w:b/>
                 <w:sz w:val="16"/>
               </w:rPr>
-              <w:t>6-60</w:t>
+              <w:t>53</w:t>
             </w:r>
           </w:p>
           <w:p>
@@ -10869,7 +10869,7 @@
                 <w:b/>
                 <w:sz w:val="16"/>
               </w:rPr>
-              <w:t>6-60</w:t>
+              <w:t>54</w:t>
             </w:r>
           </w:p>
           <w:p>
@@ -10892,7 +10892,7 @@
                 <w:b/>
                 <w:sz w:val="16"/>
               </w:rPr>
-              <w:t>6-60</w:t>
+              <w:t>54</w:t>
             </w:r>
           </w:p>
           <w:p>
@@ -10915,7 +10915,7 @@
                 <w:b/>
                 <w:sz w:val="16"/>
               </w:rPr>
-              <w:t>6-60</w:t>
+              <w:t>54</w:t>
             </w:r>
           </w:p>
           <w:p>
@@ -10940,7 +10940,7 @@
                 <w:b/>
                 <w:sz w:val="16"/>
               </w:rPr>
-              <w:t>6-60</w:t>
+              <w:t>55</w:t>
             </w:r>
           </w:p>
           <w:p>
@@ -10963,7 +10963,7 @@
                 <w:b/>
                 <w:sz w:val="16"/>
               </w:rPr>
-              <w:t>6-60</w:t>
+              <w:t>55</w:t>
             </w:r>
           </w:p>
           <w:p>
@@ -10986,7 +10986,7 @@
                 <w:b/>
                 <w:sz w:val="16"/>
               </w:rPr>
-              <w:t>6-60</w:t>
+              <w:t>55</w:t>
             </w:r>
           </w:p>
           <w:p>
@@ -11011,7 +11011,7 @@
                 <w:b/>
                 <w:sz w:val="16"/>
               </w:rPr>
-              <w:t>6-60</w:t>
+              <w:t>56</w:t>
             </w:r>
           </w:p>
           <w:p>
@@ -11034,7 +11034,7 @@
                 <w:b/>
                 <w:sz w:val="16"/>
               </w:rPr>
-              <w:t>6-60</w:t>
+              <w:t>56</w:t>
             </w:r>
           </w:p>
           <w:p>
@@ -11057,7 +11057,7 @@
                 <w:b/>
                 <w:sz w:val="16"/>
               </w:rPr>
-              <w:t>6-60</w:t>
+              <w:t>56</w:t>
             </w:r>
           </w:p>
           <w:p>
@@ -11082,7 +11082,7 @@
                 <w:b/>
                 <w:sz w:val="16"/>
               </w:rPr>
-              <w:t>6-60</w:t>
+              <w:t>57</w:t>
             </w:r>
           </w:p>
           <w:p>
@@ -11105,7 +11105,7 @@
                 <w:b/>
                 <w:sz w:val="16"/>
               </w:rPr>
-              <w:t>6-60</w:t>
+              <w:t>57</w:t>
             </w:r>
           </w:p>
           <w:p>
@@ -11128,7 +11128,7 @@
                 <w:b/>
                 <w:sz w:val="16"/>
               </w:rPr>
-              <w:t>6-60</w:t>
+              <w:t>57</w:t>
             </w:r>
           </w:p>
           <w:p>
@@ -11153,7 +11153,7 @@
                 <w:b/>
                 <w:sz w:val="16"/>
               </w:rPr>
-              <w:t>6-60</w:t>
+              <w:t>57</w:t>
             </w:r>
           </w:p>
           <w:p>
@@ -11176,7 +11176,7 @@
                 <w:b/>
                 <w:sz w:val="16"/>
               </w:rPr>
-              <w:t>6-60</w:t>
+              <w:t>57</w:t>
             </w:r>
           </w:p>
           <w:p>
@@ -11199,7 +11199,7 @@
                 <w:b/>
                 <w:sz w:val="16"/>
               </w:rPr>
-              <w:t>6-60</w:t>
+              <w:t>57</w:t>
             </w:r>
           </w:p>
           <w:p>
@@ -11224,7 +11224,7 @@
                 <w:b/>
                 <w:sz w:val="16"/>
               </w:rPr>
-              <w:t>6-60</w:t>
+              <w:t>58</w:t>
             </w:r>
           </w:p>
           <w:p>
@@ -11247,7 +11247,7 @@
                 <w:b/>
                 <w:sz w:val="16"/>
               </w:rPr>
-              <w:t>6-60</w:t>
+              <w:t>58</w:t>
             </w:r>
           </w:p>
           <w:p>
@@ -11270,7 +11270,7 @@
                 <w:b/>
                 <w:sz w:val="16"/>
               </w:rPr>
-              <w:t>6-60</w:t>
+              <w:t>58</w:t>
             </w:r>
           </w:p>
           <w:p>
@@ -11295,7 +11295,7 @@
                 <w:b/>
                 <w:sz w:val="16"/>
               </w:rPr>
-              <w:t>6-60</w:t>
+              <w:t>59</w:t>
             </w:r>
           </w:p>
           <w:p>
@@ -11318,7 +11318,7 @@
                 <w:b/>
                 <w:sz w:val="16"/>
               </w:rPr>
-              <w:t>6-60</w:t>
+              <w:t>59</w:t>
             </w:r>
           </w:p>
           <w:p>
@@ -11341,7 +11341,7 @@
                 <w:b/>
                 <w:sz w:val="16"/>
               </w:rPr>
-              <w:t>6-60</w:t>
+              <w:t>59</w:t>
             </w:r>
           </w:p>
           <w:p>
@@ -11366,7 +11366,7 @@
                 <w:b/>
                 <w:sz w:val="16"/>
               </w:rPr>
-              <w:t>6-60</w:t>
+              <w:t>60</w:t>
             </w:r>
           </w:p>
           <w:p>
@@ -11389,7 +11389,7 @@
                 <w:b/>
                 <w:sz w:val="16"/>
               </w:rPr>
-              <w:t>6-60</w:t>
+              <w:t>60</w:t>
             </w:r>
           </w:p>
           <w:p>
@@ -11412,7 +11412,7 @@
                 <w:b/>
                 <w:sz w:val="16"/>
               </w:rPr>
-              <w:t>6-60</w:t>
+              <w:t>60</w:t>
             </w:r>
           </w:p>
           <w:p>
@@ -11437,7 +11437,7 @@
                 <w:b/>
                 <w:sz w:val="16"/>
               </w:rPr>
-              <w:t>61-63</w:t>
+              <w:t>61</w:t>
             </w:r>
           </w:p>
           <w:p>
@@ -11484,7 +11484,7 @@
                 <w:b/>
                 <w:sz w:val="16"/>
               </w:rPr>
-              <w:t>61-63</w:t>
+              <w:t>61</w:t>
             </w:r>
           </w:p>
           <w:p>
@@ -11507,7 +11507,7 @@
                 <w:b/>
                 <w:sz w:val="16"/>
               </w:rPr>
-              <w:t>61-63</w:t>
+              <w:t>61</w:t>
             </w:r>
           </w:p>
           <w:p>
@@ -11532,7 +11532,7 @@
                 <w:b/>
                 <w:sz w:val="16"/>
               </w:rPr>
-              <w:t>61-63</w:t>
+              <w:t>62</w:t>
             </w:r>
           </w:p>
           <w:p>
@@ -11555,7 +11555,7 @@
                 <w:b/>
                 <w:sz w:val="16"/>
               </w:rPr>
-              <w:t>61-63</w:t>
+              <w:t>62</w:t>
             </w:r>
           </w:p>
           <w:p>
@@ -11578,7 +11578,7 @@
                 <w:b/>
                 <w:sz w:val="16"/>
               </w:rPr>
-              <w:t>61-63</w:t>
+              <w:t>62</w:t>
             </w:r>
           </w:p>
           <w:p>
@@ -11603,7 +11603,7 @@
                 <w:b/>
                 <w:sz w:val="16"/>
               </w:rPr>
-              <w:t>61-63</w:t>
+              <w:t>63</w:t>
             </w:r>
           </w:p>
           <w:p>
@@ -11626,7 +11626,7 @@
                 <w:b/>
                 <w:sz w:val="16"/>
               </w:rPr>
-              <w:t>61-63</w:t>
+              <w:t>63</w:t>
             </w:r>
           </w:p>
           <w:p>
@@ -11649,7 +11649,7 @@
                 <w:b/>
                 <w:sz w:val="16"/>
               </w:rPr>
-              <w:t>61-63</w:t>
+              <w:t>63</w:t>
             </w:r>
           </w:p>
           <w:p>
@@ -11674,7 +11674,7 @@
                 <w:b/>
                 <w:sz w:val="16"/>
               </w:rPr>
-              <w:t>61-63</w:t>
+              <w:t>63</w:t>
             </w:r>
           </w:p>
           <w:p>
@@ -11697,7 +11697,7 @@
                 <w:b/>
                 <w:sz w:val="16"/>
               </w:rPr>
-              <w:t>61-63</w:t>
+              <w:t>63</w:t>
             </w:r>
           </w:p>
           <w:p>
@@ -11720,7 +11720,7 @@
                 <w:b/>
                 <w:sz w:val="16"/>
               </w:rPr>
-              <w:t>61-63</w:t>
+              <w:t>63</w:t>
             </w:r>
           </w:p>
           <w:p>
@@ -13863,7 +13863,7 @@
                 <w:b/>
                 <w:sz w:val="16"/>
               </w:rPr>
-              <w:t>1-8</w:t>
+              <w:t>1</w:t>
             </w:r>
           </w:p>
           <w:p>
@@ -13958,7 +13958,7 @@
                 <w:b/>
                 <w:sz w:val="16"/>
               </w:rPr>
-              <w:t>1-8</w:t>
+              <w:t>1</w:t>
             </w:r>
           </w:p>
           <w:p>
@@ -13981,7 +13981,7 @@
                 <w:b/>
                 <w:sz w:val="16"/>
               </w:rPr>
-              <w:t>1-8</w:t>
+              <w:t>1</w:t>
             </w:r>
           </w:p>
           <w:p>
@@ -14006,7 +14006,7 @@
                 <w:b/>
                 <w:sz w:val="16"/>
               </w:rPr>
-              <w:t>1-8</w:t>
+              <w:t>2-8</w:t>
             </w:r>
           </w:p>
           <w:p>
@@ -14029,7 +14029,7 @@
                 <w:b/>
                 <w:sz w:val="16"/>
               </w:rPr>
-              <w:t>1-8</w:t>
+              <w:t>2-8</w:t>
             </w:r>
           </w:p>
           <w:p>
@@ -14052,7 +14052,7 @@
                 <w:b/>
                 <w:sz w:val="16"/>
               </w:rPr>
-              <w:t>1-8</w:t>
+              <w:t>2-8</w:t>
             </w:r>
           </w:p>
           <w:p>
@@ -14371,7 +14371,7 @@
                 <w:b/>
                 <w:sz w:val="16"/>
               </w:rPr>
-              <w:t>28-30</w:t>
+              <w:t>28-29</w:t>
             </w:r>
           </w:p>
           <w:p>
@@ -14402,7 +14402,7 @@
                 <w:b/>
                 <w:sz w:val="16"/>
               </w:rPr>
-              <w:t>28-30</w:t>
+              <w:t>28-29</w:t>
             </w:r>
           </w:p>
           <w:p>
@@ -14425,7 +14425,7 @@
                 <w:b/>
                 <w:sz w:val="16"/>
               </w:rPr>
-              <w:t>28-30</w:t>
+              <w:t>28-29</w:t>
             </w:r>
           </w:p>
           <w:p>
@@ -14450,7 +14450,7 @@
                 <w:b/>
                 <w:sz w:val="16"/>
               </w:rPr>
-              <w:t>28-30</w:t>
+              <w:t>30</w:t>
             </w:r>
           </w:p>
           <w:p>
@@ -14473,7 +14473,7 @@
                 <w:b/>
                 <w:sz w:val="16"/>
               </w:rPr>
-              <w:t>28-30</w:t>
+              <w:t>30</w:t>
             </w:r>
           </w:p>
           <w:p>
@@ -14496,7 +14496,7 @@
                 <w:b/>
                 <w:sz w:val="16"/>
               </w:rPr>
-              <w:t>28-30</w:t>
+              <w:t>30</w:t>
             </w:r>
           </w:p>
           <w:p>
@@ -14521,7 +14521,7 @@
                 <w:b/>
                 <w:sz w:val="16"/>
               </w:rPr>
-              <w:t>28-30</w:t>
+              <w:t>30</w:t>
             </w:r>
           </w:p>
           <w:p>
@@ -14544,7 +14544,7 @@
                 <w:b/>
                 <w:sz w:val="16"/>
               </w:rPr>
-              <w:t>28-30</w:t>
+              <w:t>30</w:t>
             </w:r>
           </w:p>
           <w:p>
@@ -14567,7 +14567,7 @@
                 <w:b/>
                 <w:sz w:val="16"/>
               </w:rPr>
-              <w:t>28-30</w:t>
+              <w:t>30</w:t>
             </w:r>
           </w:p>
           <w:p>
@@ -15098,7 +15098,7 @@
                 <w:b/>
                 <w:sz w:val="16"/>
               </w:rPr>
-              <w:t>37-39</w:t>
+              <w:t>39</w:t>
             </w:r>
           </w:p>
           <w:p>
@@ -15121,7 +15121,7 @@
                 <w:b/>
                 <w:sz w:val="16"/>
               </w:rPr>
-              <w:t>37-39</w:t>
+              <w:t>39</w:t>
             </w:r>
           </w:p>
           <w:p>
@@ -15144,7 +15144,7 @@
                 <w:b/>
                 <w:sz w:val="16"/>
               </w:rPr>
-              <w:t>37-39</w:t>
+              <w:t>39</w:t>
             </w:r>
           </w:p>
           <w:p>
@@ -15378,38 +15378,30 @@
                 <w:b/>
                 <w:sz w:val="16"/>
               </w:rPr>
-              <w:t>4-6</w:t>
-            </w:r>
-          </w:p>
-          <w:p>
-            <w:r>
-              <w:rPr>
-                <w:sz w:val="18"/>
-              </w:rPr>
-              <w:t>From the family of Judah:</w:t>
-            </w:r>
-          </w:p>
-          <w:p>
-            <w:r>
-              <w:rPr>
-                <w:sz w:val="18"/>
-              </w:rPr>
-              <w:t>Athaiah son of Uzziah, the son of Zechariah, the son of Amariah, the son of Shephatiah, the son of Mahalalel, from the family line of Perez; Maaseiah son of Baruch, the son of Col-Hozeh, the son of Hazaiah, the son of Adaiah, the son of Joiarib, the son of Zechariah, the son of the Shilonite. The descendants of Perez who lived in Jerusalem numbered 468 valiant men.</w:t>
-            </w:r>
-          </w:p>
-        </w:tc>
-        <w:tc>
-          <w:tcPr>
-            <w:tcW w:type="dxa" w:w="2880"/>
-          </w:tcPr>
-          <w:p>
-            <w:r/>
-            <w:r>
-              <w:rPr>
-                <w:b/>
-                <w:sz w:val="16"/>
-              </w:rPr>
-              <w:t>4-6</w:t>
+              <w:t>4</w:t>
+            </w:r>
+          </w:p>
+          <w:p>
+            <w:r>
+              <w:rPr>
+                <w:sz w:val="18"/>
+              </w:rPr>
+              <w:t>↑ 위 MSG(3-4) 계속</w:t>
+            </w:r>
+          </w:p>
+        </w:tc>
+        <w:tc>
+          <w:tcPr>
+            <w:tcW w:type="dxa" w:w="2880"/>
+          </w:tcPr>
+          <w:p>
+            <w:r/>
+            <w:r>
+              <w:rPr>
+                <w:b/>
+                <w:sz w:val="16"/>
+              </w:rPr>
+              <w:t>4</w:t>
             </w:r>
           </w:p>
           <w:p>
@@ -15432,7 +15424,7 @@
                 <w:b/>
                 <w:sz w:val="16"/>
               </w:rPr>
-              <w:t>4-6</w:t>
+              <w:t>4</w:t>
             </w:r>
           </w:p>
           <w:p>
@@ -15465,7 +15457,15 @@
               <w:rPr>
                 <w:sz w:val="18"/>
               </w:rPr>
-              <w:t>↑ 위 MSG(4-6) 계속</w:t>
+              <w:t>From the family of Judah:</w:t>
+            </w:r>
+          </w:p>
+          <w:p>
+            <w:r>
+              <w:rPr>
+                <w:sz w:val="18"/>
+              </w:rPr>
+              <w:t>Athaiah son of Uzziah, the son of Zechariah, the son of Amariah, the son of Shephatiah, the son of Mahalalel, from the family line of Perez; Maaseiah son of Baruch, the son of Col-Hozeh, the son of Hazaiah, the son of Adaiah, the son of Joiarib, the son of Zechariah, the son of the Shilonite. The descendants of Perez who lived in Jerusalem numbered 468 valiant men.</w:t>
             </w:r>
           </w:p>
         </w:tc>
@@ -15528,7 +15528,7 @@
                 <w:b/>
                 <w:sz w:val="16"/>
               </w:rPr>
-              <w:t>7-9</w:t>
+              <w:t>7</w:t>
             </w:r>
           </w:p>
           <w:p>
@@ -15559,7 +15559,7 @@
                 <w:b/>
                 <w:sz w:val="16"/>
               </w:rPr>
-              <w:t>7-9</w:t>
+              <w:t>7</w:t>
             </w:r>
           </w:p>
           <w:p>
@@ -15582,7 +15582,7 @@
                 <w:b/>
                 <w:sz w:val="16"/>
               </w:rPr>
-              <w:t>7-9</w:t>
+              <w:t>7</w:t>
             </w:r>
           </w:p>
           <w:p>
@@ -15678,7 +15678,7 @@
                 <w:b/>
                 <w:sz w:val="16"/>
               </w:rPr>
-              <w:t>10-14</w:t>
+              <w:t>10</w:t>
             </w:r>
           </w:p>
           <w:p>
@@ -15709,7 +15709,7 @@
                 <w:b/>
                 <w:sz w:val="16"/>
               </w:rPr>
-              <w:t>10-14</w:t>
+              <w:t>10</w:t>
             </w:r>
           </w:p>
           <w:p>
@@ -15732,7 +15732,7 @@
                 <w:b/>
                 <w:sz w:val="16"/>
               </w:rPr>
-              <w:t>10-14</w:t>
+              <w:t>10</w:t>
             </w:r>
           </w:p>
           <w:p>
@@ -15828,7 +15828,7 @@
                 <w:b/>
                 <w:sz w:val="16"/>
               </w:rPr>
-              <w:t>15-18</w:t>
+              <w:t>15</w:t>
             </w:r>
           </w:p>
           <w:p>
@@ -15859,7 +15859,7 @@
                 <w:b/>
                 <w:sz w:val="16"/>
               </w:rPr>
-              <w:t>15-18</w:t>
+              <w:t>15</w:t>
             </w:r>
           </w:p>
           <w:p>
@@ -15882,7 +15882,7 @@
                 <w:b/>
                 <w:sz w:val="16"/>
               </w:rPr>
-              <w:t>15-18</w:t>
+              <w:t>15</w:t>
             </w:r>
           </w:p>
           <w:p>
@@ -16412,7 +16412,7 @@
                 <w:b/>
                 <w:sz w:val="16"/>
               </w:rPr>
-              <w:t>25-30</w:t>
+              <w:t>25</w:t>
             </w:r>
           </w:p>
           <w:p>
@@ -16579,7 +16579,7 @@
                 <w:b/>
                 <w:sz w:val="16"/>
               </w:rPr>
-              <w:t>25-30</w:t>
+              <w:t>25</w:t>
             </w:r>
           </w:p>
           <w:p>
@@ -16602,7 +16602,7 @@
                 <w:b/>
                 <w:sz w:val="16"/>
               </w:rPr>
-              <w:t>25-30</w:t>
+              <w:t>25</w:t>
             </w:r>
           </w:p>
           <w:p>
@@ -16627,7 +16627,7 @@
                 <w:b/>
                 <w:sz w:val="16"/>
               </w:rPr>
-              <w:t>25-30</w:t>
+              <w:t>25</w:t>
             </w:r>
           </w:p>
           <w:p>
@@ -16650,7 +16650,7 @@
                 <w:b/>
                 <w:sz w:val="16"/>
               </w:rPr>
-              <w:t>25-30</w:t>
+              <w:t>25</w:t>
             </w:r>
           </w:p>
           <w:p>
@@ -16673,7 +16673,7 @@
                 <w:b/>
                 <w:sz w:val="16"/>
               </w:rPr>
-              <w:t>25-30</w:t>
+              <w:t>25</w:t>
             </w:r>
           </w:p>
           <w:p>
@@ -16698,7 +16698,7 @@
                 <w:b/>
                 <w:sz w:val="16"/>
               </w:rPr>
-              <w:t>25-30</w:t>
+              <w:t>25</w:t>
             </w:r>
           </w:p>
           <w:p>
@@ -16721,7 +16721,7 @@
                 <w:b/>
                 <w:sz w:val="16"/>
               </w:rPr>
-              <w:t>25-30</w:t>
+              <w:t>25</w:t>
             </w:r>
           </w:p>
           <w:p>
@@ -16744,7 +16744,7 @@
                 <w:b/>
                 <w:sz w:val="16"/>
               </w:rPr>
-              <w:t>25-30</w:t>
+              <w:t>25</w:t>
             </w:r>
           </w:p>
           <w:p>
@@ -16769,7 +16769,7 @@
                 <w:b/>
                 <w:sz w:val="16"/>
               </w:rPr>
-              <w:t>25-30</w:t>
+              <w:t>25</w:t>
             </w:r>
           </w:p>
           <w:p>
@@ -16792,7 +16792,7 @@
                 <w:b/>
                 <w:sz w:val="16"/>
               </w:rPr>
-              <w:t>25-30</w:t>
+              <w:t>25</w:t>
             </w:r>
           </w:p>
           <w:p>
@@ -16815,7 +16815,7 @@
                 <w:b/>
                 <w:sz w:val="16"/>
               </w:rPr>
-              <w:t>25-30</w:t>
+              <w:t>25</w:t>
             </w:r>
           </w:p>
           <w:p>
@@ -16840,7 +16840,7 @@
                 <w:b/>
                 <w:sz w:val="16"/>
               </w:rPr>
-              <w:t>25-30</w:t>
+              <w:t>26</w:t>
             </w:r>
           </w:p>
           <w:p>
@@ -16863,7 +16863,7 @@
                 <w:b/>
                 <w:sz w:val="16"/>
               </w:rPr>
-              <w:t>25-30</w:t>
+              <w:t>26</w:t>
             </w:r>
           </w:p>
           <w:p>
@@ -16886,7 +16886,7 @@
                 <w:b/>
                 <w:sz w:val="16"/>
               </w:rPr>
-              <w:t>25-30</w:t>
+              <w:t>26</w:t>
             </w:r>
           </w:p>
           <w:p>
@@ -16911,7 +16911,7 @@
                 <w:b/>
                 <w:sz w:val="16"/>
               </w:rPr>
-              <w:t>25-30</w:t>
+              <w:t>26</w:t>
             </w:r>
           </w:p>
           <w:p>
@@ -16934,7 +16934,7 @@
                 <w:b/>
                 <w:sz w:val="16"/>
               </w:rPr>
-              <w:t>25-30</w:t>
+              <w:t>26</w:t>
             </w:r>
           </w:p>
           <w:p>
@@ -16957,7 +16957,7 @@
                 <w:b/>
                 <w:sz w:val="16"/>
               </w:rPr>
-              <w:t>25-30</w:t>
+              <w:t>26</w:t>
             </w:r>
           </w:p>
           <w:p>
@@ -16982,7 +16982,7 @@
                 <w:b/>
                 <w:sz w:val="16"/>
               </w:rPr>
-              <w:t>25-30</w:t>
+              <w:t>26</w:t>
             </w:r>
           </w:p>
           <w:p>
@@ -17005,7 +17005,7 @@
                 <w:b/>
                 <w:sz w:val="16"/>
               </w:rPr>
-              <w:t>25-30</w:t>
+              <w:t>26</w:t>
             </w:r>
           </w:p>
           <w:p>
@@ -17028,7 +17028,7 @@
                 <w:b/>
                 <w:sz w:val="16"/>
               </w:rPr>
-              <w:t>25-30</w:t>
+              <w:t>26</w:t>
             </w:r>
           </w:p>
           <w:p>
@@ -17053,7 +17053,7 @@
                 <w:b/>
                 <w:sz w:val="16"/>
               </w:rPr>
-              <w:t>25-30</w:t>
+              <w:t>27</w:t>
             </w:r>
           </w:p>
           <w:p>
@@ -17076,7 +17076,7 @@
                 <w:b/>
                 <w:sz w:val="16"/>
               </w:rPr>
-              <w:t>25-30</w:t>
+              <w:t>27</w:t>
             </w:r>
           </w:p>
           <w:p>
@@ -17099,7 +17099,7 @@
                 <w:b/>
                 <w:sz w:val="16"/>
               </w:rPr>
-              <w:t>25-30</w:t>
+              <w:t>27</w:t>
             </w:r>
           </w:p>
           <w:p>
@@ -17124,7 +17124,7 @@
                 <w:b/>
                 <w:sz w:val="16"/>
               </w:rPr>
-              <w:t>25-30</w:t>
+              <w:t>27</w:t>
             </w:r>
           </w:p>
           <w:p>
@@ -17147,7 +17147,7 @@
                 <w:b/>
                 <w:sz w:val="16"/>
               </w:rPr>
-              <w:t>25-30</w:t>
+              <w:t>27</w:t>
             </w:r>
           </w:p>
           <w:p>
@@ -17170,7 +17170,7 @@
                 <w:b/>
                 <w:sz w:val="16"/>
               </w:rPr>
-              <w:t>25-30</w:t>
+              <w:t>27</w:t>
             </w:r>
           </w:p>
           <w:p>
@@ -17195,7 +17195,7 @@
                 <w:b/>
                 <w:sz w:val="16"/>
               </w:rPr>
-              <w:t>25-30</w:t>
+              <w:t>28</w:t>
             </w:r>
           </w:p>
           <w:p>
@@ -17218,7 +17218,7 @@
                 <w:b/>
                 <w:sz w:val="16"/>
               </w:rPr>
-              <w:t>25-30</w:t>
+              <w:t>28</w:t>
             </w:r>
           </w:p>
           <w:p>
@@ -17241,7 +17241,7 @@
                 <w:b/>
                 <w:sz w:val="16"/>
               </w:rPr>
-              <w:t>25-30</w:t>
+              <w:t>28</w:t>
             </w:r>
           </w:p>
           <w:p>
@@ -17266,7 +17266,7 @@
                 <w:b/>
                 <w:sz w:val="16"/>
               </w:rPr>
-              <w:t>25-30</w:t>
+              <w:t>28</w:t>
             </w:r>
           </w:p>
           <w:p>
@@ -17289,7 +17289,7 @@
                 <w:b/>
                 <w:sz w:val="16"/>
               </w:rPr>
-              <w:t>25-30</w:t>
+              <w:t>28</w:t>
             </w:r>
           </w:p>
           <w:p>
@@ -17312,7 +17312,7 @@
                 <w:b/>
                 <w:sz w:val="16"/>
               </w:rPr>
-              <w:t>25-30</w:t>
+              <w:t>28</w:t>
             </w:r>
           </w:p>
           <w:p>
@@ -17337,7 +17337,7 @@
                 <w:b/>
                 <w:sz w:val="16"/>
               </w:rPr>
-              <w:t>25-30</w:t>
+              <w:t>29</w:t>
             </w:r>
           </w:p>
           <w:p>
@@ -17360,7 +17360,7 @@
                 <w:b/>
                 <w:sz w:val="16"/>
               </w:rPr>
-              <w:t>25-30</w:t>
+              <w:t>29</w:t>
             </w:r>
           </w:p>
           <w:p>
@@ -17383,7 +17383,7 @@
                 <w:b/>
                 <w:sz w:val="16"/>
               </w:rPr>
-              <w:t>25-30</w:t>
+              <w:t>29</w:t>
             </w:r>
           </w:p>
           <w:p>
@@ -17408,7 +17408,7 @@
                 <w:b/>
                 <w:sz w:val="16"/>
               </w:rPr>
-              <w:t>25-30</w:t>
+              <w:t>29</w:t>
             </w:r>
           </w:p>
           <w:p>
@@ -17431,7 +17431,7 @@
                 <w:b/>
                 <w:sz w:val="16"/>
               </w:rPr>
-              <w:t>25-30</w:t>
+              <w:t>29</w:t>
             </w:r>
           </w:p>
           <w:p>
@@ -17454,7 +17454,7 @@
                 <w:b/>
                 <w:sz w:val="16"/>
               </w:rPr>
-              <w:t>25-30</w:t>
+              <w:t>29</w:t>
             </w:r>
           </w:p>
           <w:p>
@@ -17479,7 +17479,7 @@
                 <w:b/>
                 <w:sz w:val="16"/>
               </w:rPr>
-              <w:t>25-30</w:t>
+              <w:t>29</w:t>
             </w:r>
           </w:p>
           <w:p>
@@ -17502,7 +17502,7 @@
                 <w:b/>
                 <w:sz w:val="16"/>
               </w:rPr>
-              <w:t>25-30</w:t>
+              <w:t>29</w:t>
             </w:r>
           </w:p>
           <w:p>
@@ -17525,7 +17525,7 @@
                 <w:b/>
                 <w:sz w:val="16"/>
               </w:rPr>
-              <w:t>25-30</w:t>
+              <w:t>29</w:t>
             </w:r>
           </w:p>
           <w:p>
@@ -17550,7 +17550,7 @@
                 <w:b/>
                 <w:sz w:val="16"/>
               </w:rPr>
-              <w:t>25-30</w:t>
+              <w:t>30</w:t>
             </w:r>
           </w:p>
           <w:p>
@@ -17573,7 +17573,7 @@
                 <w:b/>
                 <w:sz w:val="16"/>
               </w:rPr>
-              <w:t>25-30</w:t>
+              <w:t>30</w:t>
             </w:r>
           </w:p>
           <w:p>
@@ -17596,7 +17596,7 @@
                 <w:b/>
                 <w:sz w:val="16"/>
               </w:rPr>
-              <w:t>25-30</w:t>
+              <w:t>30</w:t>
             </w:r>
           </w:p>
           <w:p>
@@ -17621,7 +17621,7 @@
                 <w:b/>
                 <w:sz w:val="16"/>
               </w:rPr>
-              <w:t>25-30</w:t>
+              <w:t>30</w:t>
             </w:r>
           </w:p>
           <w:p>
@@ -17644,7 +17644,7 @@
                 <w:b/>
                 <w:sz w:val="16"/>
               </w:rPr>
-              <w:t>25-30</w:t>
+              <w:t>30</w:t>
             </w:r>
           </w:p>
           <w:p>
@@ -17667,7 +17667,7 @@
                 <w:b/>
                 <w:sz w:val="16"/>
               </w:rPr>
-              <w:t>25-30</w:t>
+              <w:t>30</w:t>
             </w:r>
           </w:p>
           <w:p>
@@ -17692,7 +17692,7 @@
                 <w:b/>
                 <w:sz w:val="16"/>
               </w:rPr>
-              <w:t>25-30</w:t>
+              <w:t>30</w:t>
             </w:r>
           </w:p>
           <w:p>
@@ -17715,7 +17715,7 @@
                 <w:b/>
                 <w:sz w:val="16"/>
               </w:rPr>
-              <w:t>25-30</w:t>
+              <w:t>30</w:t>
             </w:r>
           </w:p>
           <w:p>
@@ -17738,7 +17738,7 @@
                 <w:b/>
                 <w:sz w:val="16"/>
               </w:rPr>
-              <w:t>25-30</w:t>
+              <w:t>30</w:t>
             </w:r>
           </w:p>
           <w:p>
@@ -17763,7 +17763,7 @@
                 <w:b/>
                 <w:sz w:val="16"/>
               </w:rPr>
-              <w:t>25-30</w:t>
+              <w:t>30</w:t>
             </w:r>
           </w:p>
           <w:p>
@@ -17786,7 +17786,7 @@
                 <w:b/>
                 <w:sz w:val="16"/>
               </w:rPr>
-              <w:t>25-30</w:t>
+              <w:t>30</w:t>
             </w:r>
           </w:p>
           <w:p>
@@ -17809,7 +17809,7 @@
                 <w:b/>
                 <w:sz w:val="16"/>
               </w:rPr>
-              <w:t>25-30</w:t>
+              <w:t>30</w:t>
             </w:r>
           </w:p>
           <w:p>
@@ -17834,7 +17834,7 @@
                 <w:b/>
                 <w:sz w:val="16"/>
               </w:rPr>
-              <w:t>25-30</w:t>
+              <w:t>30</w:t>
             </w:r>
           </w:p>
           <w:p>
@@ -17857,7 +17857,7 @@
                 <w:b/>
                 <w:sz w:val="16"/>
               </w:rPr>
-              <w:t>25-30</w:t>
+              <w:t>30</w:t>
             </w:r>
           </w:p>
           <w:p>
@@ -17880,7 +17880,7 @@
                 <w:b/>
                 <w:sz w:val="16"/>
               </w:rPr>
-              <w:t>25-30</w:t>
+              <w:t>30</w:t>
             </w:r>
           </w:p>
           <w:p>
@@ -17905,7 +17905,7 @@
                 <w:b/>
                 <w:sz w:val="16"/>
               </w:rPr>
-              <w:t>31-36</w:t>
+              <w:t>31</w:t>
             </w:r>
           </w:p>
           <w:p>
@@ -18008,7 +18008,7 @@
                 <w:b/>
                 <w:sz w:val="16"/>
               </w:rPr>
-              <w:t>31-36</w:t>
+              <w:t>31</w:t>
             </w:r>
           </w:p>
           <w:p>
@@ -18031,7 +18031,7 @@
                 <w:b/>
                 <w:sz w:val="16"/>
               </w:rPr>
-              <w:t>31-36</w:t>
+              <w:t>31</w:t>
             </w:r>
           </w:p>
           <w:p>
@@ -18056,7 +18056,7 @@
                 <w:b/>
                 <w:sz w:val="16"/>
               </w:rPr>
-              <w:t>31-36</w:t>
+              <w:t>31</w:t>
             </w:r>
           </w:p>
           <w:p>
@@ -18079,7 +18079,7 @@
                 <w:b/>
                 <w:sz w:val="16"/>
               </w:rPr>
-              <w:t>31-36</w:t>
+              <w:t>31</w:t>
             </w:r>
           </w:p>
           <w:p>
@@ -18102,7 +18102,7 @@
                 <w:b/>
                 <w:sz w:val="16"/>
               </w:rPr>
-              <w:t>31-36</w:t>
+              <w:t>31</w:t>
             </w:r>
           </w:p>
           <w:p>
@@ -18127,7 +18127,7 @@
                 <w:b/>
                 <w:sz w:val="16"/>
               </w:rPr>
-              <w:t>31-36</w:t>
+              <w:t>31</w:t>
             </w:r>
           </w:p>
           <w:p>
@@ -18150,7 +18150,7 @@
                 <w:b/>
                 <w:sz w:val="16"/>
               </w:rPr>
-              <w:t>31-36</w:t>
+              <w:t>31</w:t>
             </w:r>
           </w:p>
           <w:p>
@@ -18173,7 +18173,7 @@
                 <w:b/>
                 <w:sz w:val="16"/>
               </w:rPr>
-              <w:t>31-36</w:t>
+              <w:t>31</w:t>
             </w:r>
           </w:p>
           <w:p>
@@ -18198,7 +18198,7 @@
                 <w:b/>
                 <w:sz w:val="16"/>
               </w:rPr>
-              <w:t>31-36</w:t>
+              <w:t>32</w:t>
             </w:r>
           </w:p>
           <w:p>
@@ -18221,7 +18221,7 @@
                 <w:b/>
                 <w:sz w:val="16"/>
               </w:rPr>
-              <w:t>31-36</w:t>
+              <w:t>32</w:t>
             </w:r>
           </w:p>
           <w:p>
@@ -18244,7 +18244,7 @@
                 <w:b/>
                 <w:sz w:val="16"/>
               </w:rPr>
-              <w:t>31-36</w:t>
+              <w:t>32</w:t>
             </w:r>
           </w:p>
           <w:p>
@@ -18269,7 +18269,7 @@
                 <w:b/>
                 <w:sz w:val="16"/>
               </w:rPr>
-              <w:t>31-36</w:t>
+              <w:t>32</w:t>
             </w:r>
           </w:p>
           <w:p>
@@ -18292,7 +18292,7 @@
                 <w:b/>
                 <w:sz w:val="16"/>
               </w:rPr>
-              <w:t>31-36</w:t>
+              <w:t>32</w:t>
             </w:r>
           </w:p>
           <w:p>
@@ -18315,7 +18315,7 @@
                 <w:b/>
                 <w:sz w:val="16"/>
               </w:rPr>
-              <w:t>31-36</w:t>
+              <w:t>32</w:t>
             </w:r>
           </w:p>
           <w:p>
@@ -18340,7 +18340,7 @@
                 <w:b/>
                 <w:sz w:val="16"/>
               </w:rPr>
-              <w:t>31-36</w:t>
+              <w:t>33</w:t>
             </w:r>
           </w:p>
           <w:p>
@@ -18363,7 +18363,7 @@
                 <w:b/>
                 <w:sz w:val="16"/>
               </w:rPr>
-              <w:t>31-36</w:t>
+              <w:t>33</w:t>
             </w:r>
           </w:p>
           <w:p>
@@ -18386,7 +18386,7 @@
                 <w:b/>
                 <w:sz w:val="16"/>
               </w:rPr>
-              <w:t>31-36</w:t>
+              <w:t>33</w:t>
             </w:r>
           </w:p>
           <w:p>
@@ -18411,7 +18411,7 @@
                 <w:b/>
                 <w:sz w:val="16"/>
               </w:rPr>
-              <w:t>31-36</w:t>
+              <w:t>34</w:t>
             </w:r>
           </w:p>
           <w:p>
@@ -18434,7 +18434,7 @@
                 <w:b/>
                 <w:sz w:val="16"/>
               </w:rPr>
-              <w:t>31-36</w:t>
+              <w:t>34</w:t>
             </w:r>
           </w:p>
           <w:p>
@@ -18457,7 +18457,7 @@
                 <w:b/>
                 <w:sz w:val="16"/>
               </w:rPr>
-              <w:t>31-36</w:t>
+              <w:t>34</w:t>
             </w:r>
           </w:p>
           <w:p>
@@ -18482,7 +18482,7 @@
                 <w:b/>
                 <w:sz w:val="16"/>
               </w:rPr>
-              <w:t>31-36</w:t>
+              <w:t>34</w:t>
             </w:r>
           </w:p>
           <w:p>
@@ -18505,7 +18505,7 @@
                 <w:b/>
                 <w:sz w:val="16"/>
               </w:rPr>
-              <w:t>31-36</w:t>
+              <w:t>34</w:t>
             </w:r>
           </w:p>
           <w:p>
@@ -18528,7 +18528,7 @@
                 <w:b/>
                 <w:sz w:val="16"/>
               </w:rPr>
-              <w:t>31-36</w:t>
+              <w:t>34</w:t>
             </w:r>
           </w:p>
           <w:p>
@@ -18553,7 +18553,7 @@
                 <w:b/>
                 <w:sz w:val="16"/>
               </w:rPr>
-              <w:t>31-36</w:t>
+              <w:t>35</w:t>
             </w:r>
           </w:p>
           <w:p>
@@ -18576,7 +18576,7 @@
                 <w:b/>
                 <w:sz w:val="16"/>
               </w:rPr>
-              <w:t>31-36</w:t>
+              <w:t>35</w:t>
             </w:r>
           </w:p>
           <w:p>
@@ -18599,7 +18599,7 @@
                 <w:b/>
                 <w:sz w:val="16"/>
               </w:rPr>
-              <w:t>31-36</w:t>
+              <w:t>35</w:t>
             </w:r>
           </w:p>
           <w:p>
@@ -18624,7 +18624,7 @@
                 <w:b/>
                 <w:sz w:val="16"/>
               </w:rPr>
-              <w:t>31-36</w:t>
+              <w:t>36</w:t>
             </w:r>
           </w:p>
           <w:p>
@@ -18647,7 +18647,7 @@
                 <w:b/>
                 <w:sz w:val="16"/>
               </w:rPr>
-              <w:t>31-36</w:t>
+              <w:t>36</w:t>
             </w:r>
           </w:p>
           <w:p>
@@ -18670,7 +18670,7 @@
                 <w:b/>
                 <w:sz w:val="16"/>
               </w:rPr>
-              <w:t>31-36</w:t>
+              <w:t>36</w:t>
             </w:r>
           </w:p>
           <w:p>
@@ -18695,7 +18695,7 @@
                 <w:b/>
                 <w:sz w:val="16"/>
               </w:rPr>
-              <w:t>31-36</w:t>
+              <w:t>36</w:t>
             </w:r>
           </w:p>
           <w:p>
@@ -18718,7 +18718,7 @@
                 <w:b/>
                 <w:sz w:val="16"/>
               </w:rPr>
-              <w:t>31-36</w:t>
+              <w:t>36</w:t>
             </w:r>
           </w:p>
           <w:p>
@@ -18741,7 +18741,7 @@
                 <w:b/>
                 <w:sz w:val="16"/>
               </w:rPr>
-              <w:t>31-36</w:t>
+              <w:t>36</w:t>
             </w:r>
           </w:p>
           <w:p>
@@ -18833,7 +18833,7 @@
                 <w:b/>
                 <w:sz w:val="16"/>
               </w:rPr>
-              <w:t>1-7</w:t>
+              <w:t>1</w:t>
             </w:r>
           </w:p>
           <w:p>
@@ -18920,7 +18920,7 @@
                 <w:b/>
                 <w:sz w:val="16"/>
               </w:rPr>
-              <w:t>1-7</w:t>
+              <w:t>1</w:t>
             </w:r>
           </w:p>
           <w:p>
@@ -18943,7 +18943,7 @@
                 <w:b/>
                 <w:sz w:val="16"/>
               </w:rPr>
-              <w:t>1-7</w:t>
+              <w:t>1</w:t>
             </w:r>
           </w:p>
           <w:p>
@@ -18968,7 +18968,7 @@
                 <w:b/>
                 <w:sz w:val="16"/>
               </w:rPr>
-              <w:t>1-7</w:t>
+              <w:t>1</w:t>
             </w:r>
           </w:p>
           <w:p>
@@ -18991,7 +18991,7 @@
                 <w:b/>
                 <w:sz w:val="16"/>
               </w:rPr>
-              <w:t>1-7</w:t>
+              <w:t>1</w:t>
             </w:r>
           </w:p>
           <w:p>
@@ -19014,7 +19014,7 @@
                 <w:b/>
                 <w:sz w:val="16"/>
               </w:rPr>
-              <w:t>1-7</w:t>
+              <w:t>1</w:t>
             </w:r>
           </w:p>
           <w:p>
@@ -19039,7 +19039,7 @@
                 <w:b/>
                 <w:sz w:val="16"/>
               </w:rPr>
-              <w:t>1-7</w:t>
+              <w:t>2</w:t>
             </w:r>
           </w:p>
           <w:p>
@@ -19062,7 +19062,7 @@
                 <w:b/>
                 <w:sz w:val="16"/>
               </w:rPr>
-              <w:t>1-7</w:t>
+              <w:t>2</w:t>
             </w:r>
           </w:p>
           <w:p>
@@ -19085,7 +19085,7 @@
                 <w:b/>
                 <w:sz w:val="16"/>
               </w:rPr>
-              <w:t>1-7</w:t>
+              <w:t>2</w:t>
             </w:r>
           </w:p>
           <w:p>
@@ -19110,7 +19110,7 @@
                 <w:b/>
                 <w:sz w:val="16"/>
               </w:rPr>
-              <w:t>1-7</w:t>
+              <w:t>3</w:t>
             </w:r>
           </w:p>
           <w:p>
@@ -19133,7 +19133,7 @@
                 <w:b/>
                 <w:sz w:val="16"/>
               </w:rPr>
-              <w:t>1-7</w:t>
+              <w:t>3</w:t>
             </w:r>
           </w:p>
           <w:p>
@@ -19156,7 +19156,7 @@
                 <w:b/>
                 <w:sz w:val="16"/>
               </w:rPr>
-              <w:t>1-7</w:t>
+              <w:t>3</w:t>
             </w:r>
           </w:p>
           <w:p>
@@ -19181,7 +19181,7 @@
                 <w:b/>
                 <w:sz w:val="16"/>
               </w:rPr>
-              <w:t>1-7</w:t>
+              <w:t>4</w:t>
             </w:r>
           </w:p>
           <w:p>
@@ -19204,7 +19204,7 @@
                 <w:b/>
                 <w:sz w:val="16"/>
               </w:rPr>
-              <w:t>1-7</w:t>
+              <w:t>4</w:t>
             </w:r>
           </w:p>
           <w:p>
@@ -19227,7 +19227,7 @@
                 <w:b/>
                 <w:sz w:val="16"/>
               </w:rPr>
-              <w:t>1-7</w:t>
+              <w:t>4</w:t>
             </w:r>
           </w:p>
           <w:p>
@@ -19252,7 +19252,7 @@
                 <w:b/>
                 <w:sz w:val="16"/>
               </w:rPr>
-              <w:t>1-7</w:t>
+              <w:t>5</w:t>
             </w:r>
           </w:p>
           <w:p>
@@ -19275,7 +19275,7 @@
                 <w:b/>
                 <w:sz w:val="16"/>
               </w:rPr>
-              <w:t>1-7</w:t>
+              <w:t>5</w:t>
             </w:r>
           </w:p>
           <w:p>
@@ -19298,7 +19298,7 @@
                 <w:b/>
                 <w:sz w:val="16"/>
               </w:rPr>
-              <w:t>1-7</w:t>
+              <w:t>5</w:t>
             </w:r>
           </w:p>
           <w:p>
@@ -19323,7 +19323,7 @@
                 <w:b/>
                 <w:sz w:val="16"/>
               </w:rPr>
-              <w:t>1-7</w:t>
+              <w:t>6</w:t>
             </w:r>
           </w:p>
           <w:p>
@@ -19346,7 +19346,7 @@
                 <w:b/>
                 <w:sz w:val="16"/>
               </w:rPr>
-              <w:t>1-7</w:t>
+              <w:t>6</w:t>
             </w:r>
           </w:p>
           <w:p>
@@ -19369,7 +19369,7 @@
                 <w:b/>
                 <w:sz w:val="16"/>
               </w:rPr>
-              <w:t>1-7</w:t>
+              <w:t>6</w:t>
             </w:r>
           </w:p>
           <w:p>
@@ -19394,7 +19394,7 @@
                 <w:b/>
                 <w:sz w:val="16"/>
               </w:rPr>
-              <w:t>1-7</w:t>
+              <w:t>7</w:t>
             </w:r>
           </w:p>
           <w:p>
@@ -19417,7 +19417,7 @@
                 <w:b/>
                 <w:sz w:val="16"/>
               </w:rPr>
-              <w:t>1-7</w:t>
+              <w:t>7</w:t>
             </w:r>
           </w:p>
           <w:p>
@@ -19440,7 +19440,7 @@
                 <w:b/>
                 <w:sz w:val="16"/>
               </w:rPr>
-              <w:t>1-7</w:t>
+              <w:t>7</w:t>
             </w:r>
           </w:p>
           <w:p>
@@ -19465,7 +19465,7 @@
                 <w:b/>
                 <w:sz w:val="16"/>
               </w:rPr>
-              <w:t>1-7</w:t>
+              <w:t>7</w:t>
             </w:r>
           </w:p>
           <w:p>
@@ -19488,7 +19488,7 @@
                 <w:b/>
                 <w:sz w:val="16"/>
               </w:rPr>
-              <w:t>1-7</w:t>
+              <w:t>7</w:t>
             </w:r>
           </w:p>
           <w:p>
@@ -19511,7 +19511,7 @@
                 <w:b/>
                 <w:sz w:val="16"/>
               </w:rPr>
-              <w:t>1-7</w:t>
+              <w:t>7</w:t>
             </w:r>
           </w:p>
           <w:p>
@@ -19536,7 +19536,7 @@
                 <w:b/>
                 <w:sz w:val="16"/>
               </w:rPr>
-              <w:t>8-9</w:t>
+              <w:t>8</w:t>
             </w:r>
           </w:p>
           <w:p>
@@ -19575,7 +19575,7 @@
                 <w:b/>
                 <w:sz w:val="16"/>
               </w:rPr>
-              <w:t>8-9</w:t>
+              <w:t>8</w:t>
             </w:r>
           </w:p>
           <w:p>
@@ -19598,7 +19598,7 @@
                 <w:b/>
                 <w:sz w:val="16"/>
               </w:rPr>
-              <w:t>8-9</w:t>
+              <w:t>8</w:t>
             </w:r>
           </w:p>
           <w:p>
@@ -19623,7 +19623,7 @@
                 <w:b/>
                 <w:sz w:val="16"/>
               </w:rPr>
-              <w:t>8-9</w:t>
+              <w:t>8</w:t>
             </w:r>
           </w:p>
           <w:p>
@@ -19646,7 +19646,7 @@
                 <w:b/>
                 <w:sz w:val="16"/>
               </w:rPr>
-              <w:t>8-9</w:t>
+              <w:t>8</w:t>
             </w:r>
           </w:p>
           <w:p>
@@ -19669,7 +19669,7 @@
                 <w:b/>
                 <w:sz w:val="16"/>
               </w:rPr>
-              <w:t>8-9</w:t>
+              <w:t>8</w:t>
             </w:r>
           </w:p>
           <w:p>
@@ -19694,7 +19694,7 @@
                 <w:b/>
                 <w:sz w:val="16"/>
               </w:rPr>
-              <w:t>8-9</w:t>
+              <w:t>9</w:t>
             </w:r>
           </w:p>
           <w:p>
@@ -19717,7 +19717,7 @@
                 <w:b/>
                 <w:sz w:val="16"/>
               </w:rPr>
-              <w:t>8-9</w:t>
+              <w:t>9</w:t>
             </w:r>
           </w:p>
           <w:p>
@@ -19740,7 +19740,7 @@
                 <w:b/>
                 <w:sz w:val="16"/>
               </w:rPr>
-              <w:t>8-9</w:t>
+              <w:t>9</w:t>
             </w:r>
           </w:p>
           <w:p>
@@ -19765,7 +19765,7 @@
                 <w:b/>
                 <w:sz w:val="16"/>
               </w:rPr>
-              <w:t>10-11</w:t>
+              <w:t>10</w:t>
             </w:r>
           </w:p>
           <w:p>
@@ -19820,7 +19820,7 @@
                 <w:b/>
                 <w:sz w:val="16"/>
               </w:rPr>
-              <w:t>10-11</w:t>
+              <w:t>10</w:t>
             </w:r>
           </w:p>
           <w:p>
@@ -19843,7 +19843,7 @@
                 <w:b/>
                 <w:sz w:val="16"/>
               </w:rPr>
-              <w:t>10-11</w:t>
+              <w:t>10</w:t>
             </w:r>
           </w:p>
           <w:p>
@@ -19868,7 +19868,7 @@
                 <w:b/>
                 <w:sz w:val="16"/>
               </w:rPr>
-              <w:t>10-11</w:t>
+              <w:t>10</w:t>
             </w:r>
           </w:p>
           <w:p>
@@ -19891,7 +19891,7 @@
                 <w:b/>
                 <w:sz w:val="16"/>
               </w:rPr>
-              <w:t>10-11</w:t>
+              <w:t>10</w:t>
             </w:r>
           </w:p>
           <w:p>
@@ -19914,7 +19914,7 @@
                 <w:b/>
                 <w:sz w:val="16"/>
               </w:rPr>
-              <w:t>10-11</w:t>
+              <w:t>10</w:t>
             </w:r>
           </w:p>
           <w:p>
@@ -19939,7 +19939,7 @@
                 <w:b/>
                 <w:sz w:val="16"/>
               </w:rPr>
-              <w:t>10-11</w:t>
+              <w:t>10</w:t>
             </w:r>
           </w:p>
           <w:p>
@@ -19962,7 +19962,7 @@
                 <w:b/>
                 <w:sz w:val="16"/>
               </w:rPr>
-              <w:t>10-11</w:t>
+              <w:t>10</w:t>
             </w:r>
           </w:p>
           <w:p>
@@ -19985,7 +19985,7 @@
                 <w:b/>
                 <w:sz w:val="16"/>
               </w:rPr>
-              <w:t>10-11</w:t>
+              <w:t>10</w:t>
             </w:r>
           </w:p>
           <w:p>
@@ -20010,7 +20010,7 @@
                 <w:b/>
                 <w:sz w:val="16"/>
               </w:rPr>
-              <w:t>10-11</w:t>
+              <w:t>10</w:t>
             </w:r>
           </w:p>
           <w:p>
@@ -20033,7 +20033,7 @@
                 <w:b/>
                 <w:sz w:val="16"/>
               </w:rPr>
-              <w:t>10-11</w:t>
+              <w:t>10</w:t>
             </w:r>
           </w:p>
           <w:p>
@@ -20056,7 +20056,7 @@
                 <w:b/>
                 <w:sz w:val="16"/>
               </w:rPr>
-              <w:t>10-11</w:t>
+              <w:t>10</w:t>
             </w:r>
           </w:p>
           <w:p>
@@ -20081,7 +20081,7 @@
                 <w:b/>
                 <w:sz w:val="16"/>
               </w:rPr>
-              <w:t>10-11</w:t>
+              <w:t>11</w:t>
             </w:r>
           </w:p>
           <w:p>
@@ -20104,7 +20104,7 @@
                 <w:b/>
                 <w:sz w:val="16"/>
               </w:rPr>
-              <w:t>10-11</w:t>
+              <w:t>11</w:t>
             </w:r>
           </w:p>
           <w:p>
@@ -20127,7 +20127,7 @@
                 <w:b/>
                 <w:sz w:val="16"/>
               </w:rPr>
-              <w:t>10-11</w:t>
+              <w:t>11</w:t>
             </w:r>
           </w:p>
           <w:p>
@@ -20152,7 +20152,7 @@
                 <w:b/>
                 <w:sz w:val="16"/>
               </w:rPr>
-              <w:t>10-11</w:t>
+              <w:t>11</w:t>
             </w:r>
           </w:p>
           <w:p>
@@ -20175,7 +20175,7 @@
                 <w:b/>
                 <w:sz w:val="16"/>
               </w:rPr>
-              <w:t>10-11</w:t>
+              <w:t>11</w:t>
             </w:r>
           </w:p>
           <w:p>
@@ -20198,7 +20198,7 @@
                 <w:b/>
                 <w:sz w:val="16"/>
               </w:rPr>
-              <w:t>10-11</w:t>
+              <w:t>11</w:t>
             </w:r>
           </w:p>
           <w:p>
@@ -20223,7 +20223,7 @@
                 <w:b/>
                 <w:sz w:val="16"/>
               </w:rPr>
-              <w:t>12-21</w:t>
+              <w:t>12</w:t>
             </w:r>
           </w:p>
           <w:p>
@@ -20406,7 +20406,7 @@
                 <w:b/>
                 <w:sz w:val="16"/>
               </w:rPr>
-              <w:t>12-21</w:t>
+              <w:t>12</w:t>
             </w:r>
           </w:p>
           <w:p>
@@ -20429,7 +20429,7 @@
                 <w:b/>
                 <w:sz w:val="16"/>
               </w:rPr>
-              <w:t>12-21</w:t>
+              <w:t>12</w:t>
             </w:r>
           </w:p>
           <w:p>
@@ -20454,7 +20454,7 @@
                 <w:b/>
                 <w:sz w:val="16"/>
               </w:rPr>
-              <w:t>12-21</w:t>
+              <w:t>12</w:t>
             </w:r>
           </w:p>
           <w:p>
@@ -20477,7 +20477,7 @@
                 <w:b/>
                 <w:sz w:val="16"/>
               </w:rPr>
-              <w:t>12-21</w:t>
+              <w:t>12</w:t>
             </w:r>
           </w:p>
           <w:p>
@@ -20500,7 +20500,7 @@
                 <w:b/>
                 <w:sz w:val="16"/>
               </w:rPr>
-              <w:t>12-21</w:t>
+              <w:t>12</w:t>
             </w:r>
           </w:p>
           <w:p>
@@ -20525,7 +20525,7 @@
                 <w:b/>
                 <w:sz w:val="16"/>
               </w:rPr>
-              <w:t>12-21</w:t>
+              <w:t>13</w:t>
             </w:r>
           </w:p>
           <w:p>
@@ -20548,7 +20548,7 @@
                 <w:b/>
                 <w:sz w:val="16"/>
               </w:rPr>
-              <w:t>12-21</w:t>
+              <w:t>13</w:t>
             </w:r>
           </w:p>
           <w:p>
@@ -20571,7 +20571,7 @@
                 <w:b/>
                 <w:sz w:val="16"/>
               </w:rPr>
-              <w:t>12-21</w:t>
+              <w:t>13</w:t>
             </w:r>
           </w:p>
           <w:p>
@@ -20596,7 +20596,7 @@
                 <w:b/>
                 <w:sz w:val="16"/>
               </w:rPr>
-              <w:t>12-21</w:t>
+              <w:t>14</w:t>
             </w:r>
           </w:p>
           <w:p>
@@ -20619,7 +20619,7 @@
                 <w:b/>
                 <w:sz w:val="16"/>
               </w:rPr>
-              <w:t>12-21</w:t>
+              <w:t>14</w:t>
             </w:r>
           </w:p>
           <w:p>
@@ -20642,7 +20642,7 @@
                 <w:b/>
                 <w:sz w:val="16"/>
               </w:rPr>
-              <w:t>12-21</w:t>
+              <w:t>14</w:t>
             </w:r>
           </w:p>
           <w:p>
@@ -20667,7 +20667,7 @@
                 <w:b/>
                 <w:sz w:val="16"/>
               </w:rPr>
-              <w:t>12-21</w:t>
+              <w:t>15</w:t>
             </w:r>
           </w:p>
           <w:p>
@@ -20690,7 +20690,7 @@
                 <w:b/>
                 <w:sz w:val="16"/>
               </w:rPr>
-              <w:t>12-21</w:t>
+              <w:t>15</w:t>
             </w:r>
           </w:p>
           <w:p>
@@ -20713,7 +20713,7 @@
                 <w:b/>
                 <w:sz w:val="16"/>
               </w:rPr>
-              <w:t>12-21</w:t>
+              <w:t>15</w:t>
             </w:r>
           </w:p>
           <w:p>
@@ -20738,7 +20738,7 @@
                 <w:b/>
                 <w:sz w:val="16"/>
               </w:rPr>
-              <w:t>12-21</w:t>
+              <w:t>16</w:t>
             </w:r>
           </w:p>
           <w:p>
@@ -20761,7 +20761,7 @@
                 <w:b/>
                 <w:sz w:val="16"/>
               </w:rPr>
-              <w:t>12-21</w:t>
+              <w:t>16</w:t>
             </w:r>
           </w:p>
           <w:p>
@@ -20784,7 +20784,7 @@
                 <w:b/>
                 <w:sz w:val="16"/>
               </w:rPr>
-              <w:t>12-21</w:t>
+              <w:t>16</w:t>
             </w:r>
           </w:p>
           <w:p>
@@ -20809,7 +20809,7 @@
                 <w:b/>
                 <w:sz w:val="16"/>
               </w:rPr>
-              <w:t>12-21</w:t>
+              <w:t>17</w:t>
             </w:r>
           </w:p>
           <w:p>
@@ -20832,7 +20832,7 @@
                 <w:b/>
                 <w:sz w:val="16"/>
               </w:rPr>
-              <w:t>12-21</w:t>
+              <w:t>17</w:t>
             </w:r>
           </w:p>
           <w:p>
@@ -20855,7 +20855,7 @@
                 <w:b/>
                 <w:sz w:val="16"/>
               </w:rPr>
-              <w:t>12-21</w:t>
+              <w:t>17</w:t>
             </w:r>
           </w:p>
           <w:p>
@@ -20880,7 +20880,7 @@
                 <w:b/>
                 <w:sz w:val="16"/>
               </w:rPr>
-              <w:t>12-21</w:t>
+              <w:t>18</w:t>
             </w:r>
           </w:p>
           <w:p>
@@ -20903,7 +20903,7 @@
                 <w:b/>
                 <w:sz w:val="16"/>
               </w:rPr>
-              <w:t>12-21</w:t>
+              <w:t>18</w:t>
             </w:r>
           </w:p>
           <w:p>
@@ -20926,7 +20926,7 @@
                 <w:b/>
                 <w:sz w:val="16"/>
               </w:rPr>
-              <w:t>12-21</w:t>
+              <w:t>18</w:t>
             </w:r>
           </w:p>
           <w:p>
@@ -20951,7 +20951,7 @@
                 <w:b/>
                 <w:sz w:val="16"/>
               </w:rPr>
-              <w:t>12-21</w:t>
+              <w:t>19</w:t>
             </w:r>
           </w:p>
           <w:p>
@@ -20974,7 +20974,7 @@
                 <w:b/>
                 <w:sz w:val="16"/>
               </w:rPr>
-              <w:t>12-21</w:t>
+              <w:t>19</w:t>
             </w:r>
           </w:p>
           <w:p>
@@ -20997,7 +20997,7 @@
                 <w:b/>
                 <w:sz w:val="16"/>
               </w:rPr>
-              <w:t>12-21</w:t>
+              <w:t>19</w:t>
             </w:r>
           </w:p>
           <w:p>
@@ -21022,7 +21022,7 @@
                 <w:b/>
                 <w:sz w:val="16"/>
               </w:rPr>
-              <w:t>12-21</w:t>
+              <w:t>20</w:t>
             </w:r>
           </w:p>
           <w:p>
@@ -21045,7 +21045,7 @@
                 <w:b/>
                 <w:sz w:val="16"/>
               </w:rPr>
-              <w:t>12-21</w:t>
+              <w:t>20</w:t>
             </w:r>
           </w:p>
           <w:p>
@@ -21068,7 +21068,7 @@
                 <w:b/>
                 <w:sz w:val="16"/>
               </w:rPr>
-              <w:t>12-21</w:t>
+              <w:t>20</w:t>
             </w:r>
           </w:p>
           <w:p>
@@ -21093,7 +21093,7 @@
                 <w:b/>
                 <w:sz w:val="16"/>
               </w:rPr>
-              <w:t>12-21</w:t>
+              <w:t>21</w:t>
             </w:r>
           </w:p>
           <w:p>
@@ -21116,7 +21116,7 @@
                 <w:b/>
                 <w:sz w:val="16"/>
               </w:rPr>
-              <w:t>12-21</w:t>
+              <w:t>21</w:t>
             </w:r>
           </w:p>
           <w:p>
@@ -21139,7 +21139,7 @@
                 <w:b/>
                 <w:sz w:val="16"/>
               </w:rPr>
-              <w:t>12-21</w:t>
+              <w:t>21</w:t>
             </w:r>
           </w:p>
           <w:p>
@@ -21164,7 +21164,7 @@
                 <w:b/>
                 <w:sz w:val="16"/>
               </w:rPr>
-              <w:t>12-21</w:t>
+              <w:t>21</w:t>
             </w:r>
           </w:p>
           <w:p>
@@ -21187,7 +21187,7 @@
                 <w:b/>
                 <w:sz w:val="16"/>
               </w:rPr>
-              <w:t>12-21</w:t>
+              <w:t>21</w:t>
             </w:r>
           </w:p>
           <w:p>
@@ -21210,7 +21210,7 @@
                 <w:b/>
                 <w:sz w:val="16"/>
               </w:rPr>
-              <w:t>12-21</w:t>
+              <w:t>21</w:t>
             </w:r>
           </w:p>
           <w:p>
@@ -21235,7 +21235,7 @@
                 <w:b/>
                 <w:sz w:val="16"/>
               </w:rPr>
-              <w:t>12-21</w:t>
+              <w:t>21</w:t>
             </w:r>
           </w:p>
           <w:p>
@@ -21258,7 +21258,7 @@
                 <w:b/>
                 <w:sz w:val="16"/>
               </w:rPr>
-              <w:t>12-21</w:t>
+              <w:t>21</w:t>
             </w:r>
           </w:p>
           <w:p>
@@ -21281,7 +21281,7 @@
                 <w:b/>
                 <w:sz w:val="16"/>
               </w:rPr>
-              <w:t>12-21</w:t>
+              <w:t>21</w:t>
             </w:r>
           </w:p>
           <w:p>
@@ -21306,7 +21306,7 @@
                 <w:b/>
                 <w:sz w:val="16"/>
               </w:rPr>
-              <w:t>12-21</w:t>
+              <w:t>21</w:t>
             </w:r>
           </w:p>
           <w:p>
@@ -21329,7 +21329,7 @@
                 <w:b/>
                 <w:sz w:val="16"/>
               </w:rPr>
-              <w:t>12-21</w:t>
+              <w:t>21</w:t>
             </w:r>
           </w:p>
           <w:p>
@@ -21352,7 +21352,7 @@
                 <w:b/>
                 <w:sz w:val="16"/>
               </w:rPr>
-              <w:t>12-21</w:t>
+              <w:t>21</w:t>
             </w:r>
           </w:p>
           <w:p>
@@ -21377,7 +21377,7 @@
                 <w:b/>
                 <w:sz w:val="16"/>
               </w:rPr>
-              <w:t>12-21</w:t>
+              <w:t>21</w:t>
             </w:r>
           </w:p>
           <w:p>
@@ -21400,7 +21400,7 @@
                 <w:b/>
                 <w:sz w:val="16"/>
               </w:rPr>
-              <w:t>12-21</w:t>
+              <w:t>21</w:t>
             </w:r>
           </w:p>
           <w:p>
@@ -21423,7 +21423,7 @@
                 <w:b/>
                 <w:sz w:val="16"/>
               </w:rPr>
-              <w:t>12-21</w:t>
+              <w:t>21</w:t>
             </w:r>
           </w:p>
           <w:p>
@@ -21448,7 +21448,7 @@
                 <w:b/>
                 <w:sz w:val="16"/>
               </w:rPr>
-              <w:t>12-21</w:t>
+              <w:t>21</w:t>
             </w:r>
           </w:p>
           <w:p>
@@ -21471,7 +21471,7 @@
                 <w:b/>
                 <w:sz w:val="16"/>
               </w:rPr>
-              <w:t>12-21</w:t>
+              <w:t>21</w:t>
             </w:r>
           </w:p>
           <w:p>
@@ -21494,7 +21494,7 @@
                 <w:b/>
                 <w:sz w:val="16"/>
               </w:rPr>
-              <w:t>12-21</w:t>
+              <w:t>21</w:t>
             </w:r>
           </w:p>
           <w:p>
@@ -21519,7 +21519,7 @@
                 <w:b/>
                 <w:sz w:val="16"/>
               </w:rPr>
-              <w:t>12-21</w:t>
+              <w:t>21</w:t>
             </w:r>
           </w:p>
           <w:p>
@@ -21542,7 +21542,7 @@
                 <w:b/>
                 <w:sz w:val="16"/>
               </w:rPr>
-              <w:t>12-21</w:t>
+              <w:t>21</w:t>
             </w:r>
           </w:p>
           <w:p>
@@ -21565,7 +21565,7 @@
                 <w:b/>
                 <w:sz w:val="16"/>
               </w:rPr>
-              <w:t>12-21</w:t>
+              <w:t>21</w:t>
             </w:r>
           </w:p>
           <w:p>
@@ -21590,7 +21590,7 @@
                 <w:b/>
                 <w:sz w:val="16"/>
               </w:rPr>
-              <w:t>12-21</w:t>
+              <w:t>21</w:t>
             </w:r>
           </w:p>
           <w:p>
@@ -21613,7 +21613,7 @@
                 <w:b/>
                 <w:sz w:val="16"/>
               </w:rPr>
-              <w:t>12-21</w:t>
+              <w:t>21</w:t>
             </w:r>
           </w:p>
           <w:p>
@@ -21636,7 +21636,7 @@
                 <w:b/>
                 <w:sz w:val="16"/>
               </w:rPr>
-              <w:t>12-21</w:t>
+              <w:t>21</w:t>
             </w:r>
           </w:p>
           <w:p>
@@ -21661,7 +21661,7 @@
                 <w:b/>
                 <w:sz w:val="16"/>
               </w:rPr>
-              <w:t>12-21</w:t>
+              <w:t>21</w:t>
             </w:r>
           </w:p>
           <w:p>
@@ -21684,7 +21684,7 @@
                 <w:b/>
                 <w:sz w:val="16"/>
               </w:rPr>
-              <w:t>12-21</w:t>
+              <w:t>21</w:t>
             </w:r>
           </w:p>
           <w:p>
@@ -21707,7 +21707,7 @@
                 <w:b/>
                 <w:sz w:val="16"/>
               </w:rPr>
-              <w:t>12-21</w:t>
+              <w:t>21</w:t>
             </w:r>
           </w:p>
           <w:p>
@@ -21732,7 +21732,7 @@
                 <w:b/>
                 <w:sz w:val="16"/>
               </w:rPr>
-              <w:t>12-21</w:t>
+              <w:t>21</w:t>
             </w:r>
           </w:p>
           <w:p>
@@ -21755,7 +21755,7 @@
                 <w:b/>
                 <w:sz w:val="16"/>
               </w:rPr>
-              <w:t>12-21</w:t>
+              <w:t>21</w:t>
             </w:r>
           </w:p>
           <w:p>
@@ -21778,7 +21778,7 @@
                 <w:b/>
                 <w:sz w:val="16"/>
               </w:rPr>
-              <w:t>12-21</w:t>
+              <w:t>21</w:t>
             </w:r>
           </w:p>
           <w:p>
@@ -21803,7 +21803,7 @@
                 <w:b/>
                 <w:sz w:val="16"/>
               </w:rPr>
-              <w:t>12-21</w:t>
+              <w:t>21</w:t>
             </w:r>
           </w:p>
           <w:p>
@@ -21826,7 +21826,7 @@
                 <w:b/>
                 <w:sz w:val="16"/>
               </w:rPr>
-              <w:t>12-21</w:t>
+              <w:t>21</w:t>
             </w:r>
           </w:p>
           <w:p>
@@ -21849,7 +21849,7 @@
                 <w:b/>
                 <w:sz w:val="16"/>
               </w:rPr>
-              <w:t>12-21</w:t>
+              <w:t>21</w:t>
             </w:r>
           </w:p>
           <w:p>
@@ -21945,7 +21945,7 @@
                 <w:b/>
                 <w:sz w:val="16"/>
               </w:rPr>
-              <w:t>23-24</w:t>
+              <w:t>23</w:t>
             </w:r>
           </w:p>
           <w:p>
@@ -22000,7 +22000,7 @@
                 <w:b/>
                 <w:sz w:val="16"/>
               </w:rPr>
-              <w:t>23-24</w:t>
+              <w:t>23</w:t>
             </w:r>
           </w:p>
           <w:p>
@@ -22023,7 +22023,7 @@
                 <w:b/>
                 <w:sz w:val="16"/>
               </w:rPr>
-              <w:t>23-24</w:t>
+              <w:t>23</w:t>
             </w:r>
           </w:p>
           <w:p>
@@ -22048,7 +22048,7 @@
                 <w:b/>
                 <w:sz w:val="16"/>
               </w:rPr>
-              <w:t>23-24</w:t>
+              <w:t>24</w:t>
             </w:r>
           </w:p>
           <w:p>
@@ -22071,7 +22071,7 @@
                 <w:b/>
                 <w:sz w:val="16"/>
               </w:rPr>
-              <w:t>23-24</w:t>
+              <w:t>24</w:t>
             </w:r>
           </w:p>
           <w:p>
@@ -22094,7 +22094,7 @@
                 <w:b/>
                 <w:sz w:val="16"/>
               </w:rPr>
-              <w:t>23-24</w:t>
+              <w:t>24</w:t>
             </w:r>
           </w:p>
           <w:p>
@@ -22119,7 +22119,7 @@
                 <w:b/>
                 <w:sz w:val="16"/>
               </w:rPr>
-              <w:t>23-24</w:t>
+              <w:t>24</w:t>
             </w:r>
           </w:p>
           <w:p>
@@ -22142,7 +22142,7 @@
                 <w:b/>
                 <w:sz w:val="16"/>
               </w:rPr>
-              <w:t>23-24</w:t>
+              <w:t>24</w:t>
             </w:r>
           </w:p>
           <w:p>
@@ -22165,7 +22165,7 @@
                 <w:b/>
                 <w:sz w:val="16"/>
               </w:rPr>
-              <w:t>23-24</w:t>
+              <w:t>24</w:t>
             </w:r>
           </w:p>
           <w:p>
@@ -22190,7 +22190,7 @@
                 <w:b/>
                 <w:sz w:val="16"/>
               </w:rPr>
-              <w:t>23-24</w:t>
+              <w:t>24</w:t>
             </w:r>
           </w:p>
           <w:p>
@@ -22213,7 +22213,7 @@
                 <w:b/>
                 <w:sz w:val="16"/>
               </w:rPr>
-              <w:t>23-24</w:t>
+              <w:t>24</w:t>
             </w:r>
           </w:p>
           <w:p>
@@ -22236,7 +22236,7 @@
                 <w:b/>
                 <w:sz w:val="16"/>
               </w:rPr>
-              <w:t>23-24</w:t>
+              <w:t>24</w:t>
             </w:r>
           </w:p>
           <w:p>
@@ -22261,7 +22261,7 @@
                 <w:b/>
                 <w:sz w:val="16"/>
               </w:rPr>
-              <w:t>23-24</w:t>
+              <w:t>24</w:t>
             </w:r>
           </w:p>
           <w:p>
@@ -22284,7 +22284,7 @@
                 <w:b/>
                 <w:sz w:val="16"/>
               </w:rPr>
-              <w:t>23-24</w:t>
+              <w:t>24</w:t>
             </w:r>
           </w:p>
           <w:p>
@@ -22307,7 +22307,7 @@
                 <w:b/>
                 <w:sz w:val="16"/>
               </w:rPr>
-              <w:t>23-24</w:t>
+              <w:t>24</w:t>
             </w:r>
           </w:p>
           <w:p>
@@ -22332,7 +22332,7 @@
                 <w:b/>
                 <w:sz w:val="16"/>
               </w:rPr>
-              <w:t>25-26</w:t>
+              <w:t>25</w:t>
             </w:r>
           </w:p>
           <w:p>
@@ -22411,7 +22411,7 @@
                 <w:b/>
                 <w:sz w:val="16"/>
               </w:rPr>
-              <w:t>25-26</w:t>
+              <w:t>25</w:t>
             </w:r>
           </w:p>
           <w:p>
@@ -22434,7 +22434,7 @@
                 <w:b/>
                 <w:sz w:val="16"/>
               </w:rPr>
-              <w:t>25-26</w:t>
+              <w:t>25</w:t>
             </w:r>
           </w:p>
           <w:p>
@@ -22459,7 +22459,7 @@
                 <w:b/>
                 <w:sz w:val="16"/>
               </w:rPr>
-              <w:t>25-26</w:t>
+              <w:t>25</w:t>
             </w:r>
           </w:p>
           <w:p>
@@ -22482,7 +22482,7 @@
                 <w:b/>
                 <w:sz w:val="16"/>
               </w:rPr>
-              <w:t>25-26</w:t>
+              <w:t>25</w:t>
             </w:r>
           </w:p>
           <w:p>
@@ -22505,7 +22505,7 @@
                 <w:b/>
                 <w:sz w:val="16"/>
               </w:rPr>
-              <w:t>25-26</w:t>
+              <w:t>25</w:t>
             </w:r>
           </w:p>
           <w:p>
@@ -22530,7 +22530,7 @@
                 <w:b/>
                 <w:sz w:val="16"/>
               </w:rPr>
-              <w:t>25-26</w:t>
+              <w:t>25</w:t>
             </w:r>
           </w:p>
           <w:p>
@@ -22553,7 +22553,7 @@
                 <w:b/>
                 <w:sz w:val="16"/>
               </w:rPr>
-              <w:t>25-26</w:t>
+              <w:t>25</w:t>
             </w:r>
           </w:p>
           <w:p>
@@ -22576,7 +22576,7 @@
                 <w:b/>
                 <w:sz w:val="16"/>
               </w:rPr>
-              <w:t>25-26</w:t>
+              <w:t>25</w:t>
             </w:r>
           </w:p>
           <w:p>
@@ -22601,7 +22601,7 @@
                 <w:b/>
                 <w:sz w:val="16"/>
               </w:rPr>
-              <w:t>25-26</w:t>
+              <w:t>25</w:t>
             </w:r>
           </w:p>
           <w:p>
@@ -22624,7 +22624,7 @@
                 <w:b/>
                 <w:sz w:val="16"/>
               </w:rPr>
-              <w:t>25-26</w:t>
+              <w:t>25</w:t>
             </w:r>
           </w:p>
           <w:p>
@@ -22647,7 +22647,7 @@
                 <w:b/>
                 <w:sz w:val="16"/>
               </w:rPr>
-              <w:t>25-26</w:t>
+              <w:t>25</w:t>
             </w:r>
           </w:p>
           <w:p>
@@ -22672,7 +22672,7 @@
                 <w:b/>
                 <w:sz w:val="16"/>
               </w:rPr>
-              <w:t>25-26</w:t>
+              <w:t>25</w:t>
             </w:r>
           </w:p>
           <w:p>
@@ -22695,7 +22695,7 @@
                 <w:b/>
                 <w:sz w:val="16"/>
               </w:rPr>
-              <w:t>25-26</w:t>
+              <w:t>25</w:t>
             </w:r>
           </w:p>
           <w:p>
@@ -22718,7 +22718,7 @@
                 <w:b/>
                 <w:sz w:val="16"/>
               </w:rPr>
-              <w:t>25-26</w:t>
+              <w:t>25</w:t>
             </w:r>
           </w:p>
           <w:p>
@@ -22743,7 +22743,7 @@
                 <w:b/>
                 <w:sz w:val="16"/>
               </w:rPr>
-              <w:t>25-26</w:t>
+              <w:t>25</w:t>
             </w:r>
           </w:p>
           <w:p>
@@ -22766,7 +22766,7 @@
                 <w:b/>
                 <w:sz w:val="16"/>
               </w:rPr>
-              <w:t>25-26</w:t>
+              <w:t>25</w:t>
             </w:r>
           </w:p>
           <w:p>
@@ -22789,7 +22789,7 @@
                 <w:b/>
                 <w:sz w:val="16"/>
               </w:rPr>
-              <w:t>25-26</w:t>
+              <w:t>25</w:t>
             </w:r>
           </w:p>
           <w:p>
@@ -22814,7 +22814,7 @@
                 <w:b/>
                 <w:sz w:val="16"/>
               </w:rPr>
-              <w:t>25-26</w:t>
+              <w:t>25</w:t>
             </w:r>
           </w:p>
           <w:p>
@@ -22837,7 +22837,7 @@
                 <w:b/>
                 <w:sz w:val="16"/>
               </w:rPr>
-              <w:t>25-26</w:t>
+              <w:t>25</w:t>
             </w:r>
           </w:p>
           <w:p>
@@ -22860,7 +22860,7 @@
                 <w:b/>
                 <w:sz w:val="16"/>
               </w:rPr>
-              <w:t>25-26</w:t>
+              <w:t>25</w:t>
             </w:r>
           </w:p>
           <w:p>
@@ -24230,7 +24230,7 @@
                 <w:b/>
                 <w:sz w:val="16"/>
               </w:rPr>
-              <w:t>20-21</w:t>
+              <w:t>20</w:t>
             </w:r>
           </w:p>
           <w:p>
@@ -24261,7 +24261,7 @@
                 <w:b/>
                 <w:sz w:val="16"/>
               </w:rPr>
-              <w:t>20-21</w:t>
+              <w:t>20</w:t>
             </w:r>
           </w:p>
           <w:p>
@@ -24284,7 +24284,7 @@
                 <w:b/>
                 <w:sz w:val="16"/>
               </w:rPr>
-              <w:t>20-21</w:t>
+              <w:t>20</w:t>
             </w:r>
           </w:p>
           <w:p>
@@ -24309,7 +24309,7 @@
                 <w:b/>
                 <w:sz w:val="16"/>
               </w:rPr>
-              <w:t>20-21</w:t>
+              <w:t>21</w:t>
             </w:r>
           </w:p>
           <w:p>
@@ -24332,7 +24332,7 @@
                 <w:b/>
                 <w:sz w:val="16"/>
               </w:rPr>
-              <w:t>20-21</w:t>
+              <w:t>21</w:t>
             </w:r>
           </w:p>
           <w:p>
@@ -24355,7 +24355,7 @@
                 <w:b/>
                 <w:sz w:val="16"/>
               </w:rPr>
-              <w:t>20-21</w:t>
+              <w:t>21</w:t>
             </w:r>
           </w:p>
           <w:p>
@@ -24743,7 +24743,7 @@
                 <w:b/>
                 <w:sz w:val="16"/>
               </w:rPr>
-              <w:t>30-31</w:t>
+              <w:t>30</w:t>
             </w:r>
           </w:p>
           <w:p>
@@ -24774,7 +24774,7 @@
                 <w:b/>
                 <w:sz w:val="16"/>
               </w:rPr>
-              <w:t>30-31</w:t>
+              <w:t>30</w:t>
             </w:r>
           </w:p>
           <w:p>
@@ -24797,7 +24797,7 @@
                 <w:b/>
                 <w:sz w:val="16"/>
               </w:rPr>
-              <w:t>30-31</w:t>
+              <w:t>30</w:t>
             </w:r>
           </w:p>
           <w:p>
@@ -24822,7 +24822,7 @@
                 <w:b/>
                 <w:sz w:val="16"/>
               </w:rPr>
-              <w:t>30-31</w:t>
+              <w:t>31</w:t>
             </w:r>
           </w:p>
           <w:p>
@@ -24845,7 +24845,7 @@
                 <w:b/>
                 <w:sz w:val="16"/>
               </w:rPr>
-              <w:t>30-31</w:t>
+              <w:t>31</w:t>
             </w:r>
           </w:p>
           <w:p>
@@ -24868,7 +24868,7 @@
                 <w:b/>
                 <w:sz w:val="16"/>
               </w:rPr>
-              <w:t>30-31</w:t>
+              <w:t>31</w:t>
             </w:r>
           </w:p>
           <w:p>

</xml_diff>